<commit_message>
Update ICU Rules Technical documentation
Added a small section and updated some links.

Change-Id: I8dbb0f24b8a9eeb6c8e852f5d4cd42e5a01d08a5
</commit_message>
<xml_diff>
--- a/HelpResourcesSources/TechnicalNotes/FieldWorks Sorting With ICU Rules.docx
+++ b/HelpResourcesSources/TechnicalNotes/FieldWorks Sorting With ICU Rules.docx
@@ -46,25 +46,7 @@
         <w:rPr>
           <w:szCs w:val="36"/>
         </w:rPr>
-        <w:t xml:space="preserve">June </w:t>
-      </w:r>
-      <w:r>
-        <w:rPr>
-          <w:szCs w:val="36"/>
-        </w:rPr>
-        <w:t>2</w:t>
-      </w:r>
-      <w:r>
-        <w:rPr>
-          <w:szCs w:val="36"/>
-        </w:rPr>
-        <w:t>6</w:t>
-      </w:r>
-      <w:r>
-        <w:rPr>
-          <w:szCs w:val="36"/>
-        </w:rPr>
-        <w:t>, 2025</w:t>
+        <w:t>July 23, 2026</w:t>
       </w:r>
     </w:p>
     <w:p>
@@ -557,17 +539,7 @@
             <w:rFonts w:eastAsia="SimSun"/>
             <w:noProof/>
           </w:rPr>
-          <w:t>Sec</w:t>
-        </w:r>
-        <w:bookmarkStart w:id="7" w:name="_GoBack"/>
-        <w:bookmarkEnd w:id="7"/>
-        <w:r>
-          <w:rPr>
-            <w:rStyle w:val="Hyperlink"/>
-            <w:rFonts w:eastAsia="SimSun"/>
-            <w:noProof/>
-          </w:rPr>
-          <w:t>ondary level</w:t>
+          <w:t>Secondary level</w:t>
         </w:r>
         <w:r>
           <w:rPr>
@@ -732,6 +704,8 @@
           </w:rPr>
           <w:t>2.4</w:t>
         </w:r>
+        <w:bookmarkStart w:id="7" w:name="_GoBack"/>
+        <w:bookmarkEnd w:id="7"/>
         <w:r>
           <w:rPr>
             <w:rFonts w:asciiTheme="minorHAnsi" w:eastAsiaTheme="minorEastAsia" w:hAnsiTheme="minorHAnsi" w:cstheme="minorBidi"/>
@@ -1000,23 +974,7 @@
             <w:rFonts w:eastAsia="SimSun"/>
             <w:noProof/>
           </w:rPr>
-          <w:t>3</w:t>
-        </w:r>
-        <w:r>
-          <w:rPr>
-            <w:rStyle w:val="Hyperlink"/>
-            <w:rFonts w:eastAsia="SimSun"/>
-            <w:noProof/>
-          </w:rPr>
-          <w:t>.</w:t>
-        </w:r>
-        <w:r>
-          <w:rPr>
-            <w:rStyle w:val="Hyperlink"/>
-            <w:rFonts w:eastAsia="SimSun"/>
-            <w:noProof/>
-          </w:rPr>
-          <w:t>2</w:t>
+          <w:t>3.2</w:t>
         </w:r>
         <w:r>
           <w:rPr>
@@ -1369,140 +1327,81 @@
           <w:szCs w:val="22"/>
         </w:rPr>
       </w:pPr>
-      <w:r>
-        <w:rPr>
-          <w:rStyle w:val="Hyperlink"/>
-          <w:rFonts w:eastAsia="SimSun"/>
-          <w:noProof/>
-        </w:rPr>
-        <w:fldChar w:fldCharType="begin"/>
-      </w:r>
-      <w:r>
-        <w:rPr>
-          <w:rStyle w:val="Hyperlink"/>
-          <w:rFonts w:eastAsia="SimSun"/>
-          <w:noProof/>
-        </w:rPr>
-        <w:instrText xml:space="preserve"> </w:instrText>
-      </w:r>
-      <w:r>
-        <w:rPr>
-          <w:noProof/>
-        </w:rPr>
-        <w:instrText>HYPERLINK \l "_Toc201668575"</w:instrText>
-      </w:r>
-      <w:r>
-        <w:rPr>
-          <w:rStyle w:val="Hyperlink"/>
-          <w:rFonts w:eastAsia="SimSun"/>
-          <w:noProof/>
-        </w:rPr>
-        <w:instrText xml:space="preserve"> </w:instrText>
-      </w:r>
-      <w:r>
-        <w:rPr>
-          <w:rStyle w:val="Hyperlink"/>
-          <w:rFonts w:eastAsia="SimSun"/>
-          <w:noProof/>
-        </w:rPr>
-      </w:r>
-      <w:r>
-        <w:rPr>
-          <w:rStyle w:val="Hyperlink"/>
-          <w:rFonts w:eastAsia="SimSun"/>
-          <w:noProof/>
-        </w:rPr>
-        <w:fldChar w:fldCharType="separate"/>
-      </w:r>
-      <w:r>
-        <w:rPr>
-          <w:rStyle w:val="Hyperlink"/>
-          <w:rFonts w:eastAsia="SimSun"/>
-          <w:noProof/>
-        </w:rPr>
-        <w:t>3.</w:t>
-      </w:r>
-      <w:r>
-        <w:rPr>
-          <w:rStyle w:val="Hyperlink"/>
-          <w:rFonts w:eastAsia="SimSun"/>
-          <w:noProof/>
-        </w:rPr>
-        <w:t>6</w:t>
-      </w:r>
-      <w:r>
-        <w:rPr>
-          <w:rFonts w:asciiTheme="minorHAnsi" w:eastAsiaTheme="minorEastAsia" w:hAnsiTheme="minorHAnsi" w:cstheme="minorBidi"/>
-          <w:noProof/>
-          <w:sz w:val="22"/>
-          <w:szCs w:val="22"/>
-        </w:rPr>
-        <w:tab/>
-      </w:r>
-      <w:r>
-        <w:rPr>
-          <w:rStyle w:val="Hyperlink"/>
-          <w:rFonts w:eastAsia="SimSun"/>
-          <w:noProof/>
-        </w:rPr>
-        <w:t>FLEx letter headings</w:t>
-      </w:r>
-      <w:r>
-        <w:rPr>
-          <w:noProof/>
-          <w:webHidden/>
-        </w:rPr>
-        <w:tab/>
-      </w:r>
-      <w:r>
-        <w:rPr>
-          <w:noProof/>
-          <w:webHidden/>
-        </w:rPr>
-        <w:fldChar w:fldCharType="begin"/>
-      </w:r>
-      <w:r>
-        <w:rPr>
-          <w:noProof/>
-          <w:webHidden/>
-        </w:rPr>
-        <w:instrText xml:space="preserve"> PAGEREF _Toc201668575 \h </w:instrText>
-      </w:r>
-      <w:r>
-        <w:rPr>
-          <w:noProof/>
-          <w:webHidden/>
-        </w:rPr>
-      </w:r>
-      <w:r>
-        <w:rPr>
-          <w:noProof/>
-          <w:webHidden/>
-        </w:rPr>
-        <w:fldChar w:fldCharType="separate"/>
-      </w:r>
-      <w:r>
-        <w:rPr>
-          <w:noProof/>
-          <w:webHidden/>
-        </w:rPr>
-        <w:t>8</w:t>
-      </w:r>
-      <w:r>
-        <w:rPr>
-          <w:noProof/>
-          <w:webHidden/>
-        </w:rPr>
-        <w:fldChar w:fldCharType="end"/>
-      </w:r>
-      <w:r>
-        <w:rPr>
-          <w:rStyle w:val="Hyperlink"/>
-          <w:rFonts w:eastAsia="SimSun"/>
-          <w:noProof/>
-        </w:rPr>
-        <w:fldChar w:fldCharType="end"/>
-      </w:r>
+      <w:hyperlink w:anchor="_Toc201668575" w:history="1">
+        <w:r>
+          <w:rPr>
+            <w:rStyle w:val="Hyperlink"/>
+            <w:rFonts w:eastAsia="SimSun"/>
+            <w:noProof/>
+          </w:rPr>
+          <w:t>3.6</w:t>
+        </w:r>
+        <w:r>
+          <w:rPr>
+            <w:rFonts w:asciiTheme="minorHAnsi" w:eastAsiaTheme="minorEastAsia" w:hAnsiTheme="minorHAnsi" w:cstheme="minorBidi"/>
+            <w:noProof/>
+            <w:sz w:val="22"/>
+            <w:szCs w:val="22"/>
+          </w:rPr>
+          <w:tab/>
+        </w:r>
+        <w:r>
+          <w:rPr>
+            <w:rStyle w:val="Hyperlink"/>
+            <w:rFonts w:eastAsia="SimSun"/>
+            <w:noProof/>
+          </w:rPr>
+          <w:t>FLEx letter headings</w:t>
+        </w:r>
+        <w:r>
+          <w:rPr>
+            <w:noProof/>
+            <w:webHidden/>
+          </w:rPr>
+          <w:tab/>
+        </w:r>
+        <w:r>
+          <w:rPr>
+            <w:noProof/>
+            <w:webHidden/>
+          </w:rPr>
+          <w:fldChar w:fldCharType="begin"/>
+        </w:r>
+        <w:r>
+          <w:rPr>
+            <w:noProof/>
+            <w:webHidden/>
+          </w:rPr>
+          <w:instrText xml:space="preserve"> PAGEREF _Toc201668575 \h </w:instrText>
+        </w:r>
+        <w:r>
+          <w:rPr>
+            <w:noProof/>
+            <w:webHidden/>
+          </w:rPr>
+        </w:r>
+        <w:r>
+          <w:rPr>
+            <w:noProof/>
+            <w:webHidden/>
+          </w:rPr>
+          <w:fldChar w:fldCharType="separate"/>
+        </w:r>
+        <w:r>
+          <w:rPr>
+            <w:noProof/>
+            <w:webHidden/>
+          </w:rPr>
+          <w:t>8</w:t>
+        </w:r>
+        <w:r>
+          <w:rPr>
+            <w:noProof/>
+            <w:webHidden/>
+          </w:rPr>
+          <w:fldChar w:fldCharType="end"/>
+        </w:r>
+      </w:hyperlink>
     </w:p>
     <w:p>
       <w:pPr>
@@ -1673,7 +1572,7 @@
             <w:noProof/>
             <w:webHidden/>
           </w:rPr>
-          <w:t>9</w:t>
+          <w:t>10</w:t>
         </w:r>
         <w:r>
           <w:rPr>
@@ -2036,14 +1935,17 @@
         <w:t>Martin Hosken wrote an excellent tutorial on using ICU collation</w:t>
       </w:r>
       <w:r>
-        <w:t xml:space="preserve"> (</w:t>
+        <w:t xml:space="preserve"> </w:t>
+      </w:r>
+      <w:r>
+        <w:t>(</w:t>
       </w:r>
       <w:hyperlink r:id="rId14" w:history="1">
         <w:r>
           <w:rPr>
             <w:rStyle w:val="Hyperlink"/>
           </w:rPr>
-          <w:t>http://scriptsource.org/cms/scripts/page.php?item_id=entry_detail&amp;uid=pnrnlhkrq9</w:t>
+          <w:t>https://writingsystems.info/articlelib/u/unicode-sort-tailoring/</w:t>
         </w:r>
       </w:hyperlink>
       <w:r>
@@ -2894,13 +2796,8 @@
       <w:r>
         <w:t xml:space="preserve">The resulting order is now </w:t>
       </w:r>
-      <w:proofErr w:type="gramStart"/>
-      <w:r>
-        <w:t>nab</w:t>
-      </w:r>
-      <w:proofErr w:type="gramEnd"/>
-      <w:r>
-        <w:t xml:space="preserve">, Nab, NAB, </w:t>
+      <w:r>
+        <w:t xml:space="preserve">nab, Nab, NAB, </w:t>
       </w:r>
       <w:proofErr w:type="spellStart"/>
       <w:r>
@@ -3356,13 +3253,8 @@
       <w:pPr>
         <w:pStyle w:val="Example"/>
       </w:pPr>
-      <w:proofErr w:type="gramStart"/>
-      <w:r>
-        <w:t>&amp;[</w:t>
-      </w:r>
-      <w:proofErr w:type="gramEnd"/>
-      <w:r>
-        <w:t>before 1]a</w:t>
+      <w:r>
+        <w:t>&amp;[before 1]a</w:t>
       </w:r>
       <w:r>
         <w:t>&lt;ā&lt;&lt;&lt;Ā</w:t>
@@ -3463,13 +3355,8 @@
       <w:pPr>
         <w:pStyle w:val="Example"/>
       </w:pPr>
-      <w:proofErr w:type="gramStart"/>
-      <w:r>
-        <w:t>&amp;[</w:t>
-      </w:r>
-      <w:proofErr w:type="gramEnd"/>
-      <w:r>
-        <w:t>before 2]a &lt;&lt; á</w:t>
+      <w:r>
+        <w:t>&amp;[before 2]a &lt;&lt; á</w:t>
       </w:r>
       <w:r>
         <w:br/>
@@ -3504,13 +3391,8 @@
       <w:pPr>
         <w:pStyle w:val="BodyText"/>
       </w:pPr>
-      <w:proofErr w:type="gramStart"/>
-      <w:r>
-        <w:t>Likewise</w:t>
-      </w:r>
-      <w:proofErr w:type="gramEnd"/>
-      <w:r>
-        <w:t xml:space="preserve"> the following rule could be used to specify </w:t>
+      <w:r>
+        <w:t xml:space="preserve">Likewise the following rule could be used to specify </w:t>
       </w:r>
       <w:proofErr w:type="spellStart"/>
       <w:r>
@@ -3550,13 +3432,8 @@
       <w:pPr>
         <w:pStyle w:val="Example"/>
       </w:pPr>
-      <w:proofErr w:type="gramStart"/>
-      <w:r>
-        <w:t>&amp;[</w:t>
-      </w:r>
-      <w:proofErr w:type="gramEnd"/>
-      <w:r>
-        <w:t xml:space="preserve">first regular]&lt;ā&lt;&lt;&lt;Ā </w:t>
+      <w:r>
+        <w:t xml:space="preserve">&amp;[first regular]&lt;ā&lt;&lt;&lt;Ā </w:t>
       </w:r>
     </w:p>
     <w:p>
@@ -4472,15 +4349,17 @@
       </w:r>
       <w:r>
         <w:br/>
-        <w:t xml:space="preserve">[last tertiary </w:t>
       </w:r>
       <w:proofErr w:type="gramStart"/>
       <w:r>
-        <w:t>ignorable]=</w:t>
+        <w:t>&amp;</w:t>
+      </w:r>
+      <w:r>
+        <w:t>[</w:t>
       </w:r>
       <w:proofErr w:type="gramEnd"/>
       <w:r>
-        <w:t>''</w:t>
+        <w:t>last tertiary ignorable]=''</w:t>
       </w:r>
     </w:p>
     <w:p>
@@ -6573,6 +6452,56 @@
     </w:p>
     <w:p>
       <w:pPr>
+        <w:pStyle w:val="BodyText"/>
+      </w:pPr>
+      <w:r>
+        <w:t xml:space="preserve">French ligature </w:t>
+      </w:r>
+      <w:proofErr w:type="spellStart"/>
+      <w:r>
+        <w:t>oe</w:t>
+      </w:r>
+      <w:proofErr w:type="spellEnd"/>
+      <w:r>
+        <w:t xml:space="preserve"> (</w:t>
+      </w:r>
+      <w:r>
+        <w:t>œ</w:t>
+      </w:r>
+      <w:r>
+        <w:t xml:space="preserve"> U+0153) and the uppercase (</w:t>
+      </w:r>
+      <w:r>
+        <w:t>Œ</w:t>
+      </w:r>
+      <w:r>
+        <w:t xml:space="preserve"> U+0152) sort identical to o and e. However, FLEx inserts a letter heading for these for some reason. These extra letter headings can be removed by using the equal syntax to make them identical.</w:t>
+      </w:r>
+    </w:p>
+    <w:p>
+      <w:pPr>
+        <w:pStyle w:val="Example"/>
+      </w:pPr>
+      <w:r>
+        <w:t>&amp;</w:t>
+      </w:r>
+      <w:proofErr w:type="spellStart"/>
+      <w:r>
+        <w:t>oe</w:t>
+      </w:r>
+      <w:proofErr w:type="spellEnd"/>
+      <w:r>
+        <w:t>=œ</w:t>
+      </w:r>
+      <w:r>
+        <w:br/>
+      </w:r>
+      <w:r>
+        <w:t>&amp;OE=Œ</w:t>
+      </w:r>
+    </w:p>
+    <w:p>
+      <w:pPr>
         <w:pStyle w:val="Heading2"/>
         <w:rPr>
           <w:rStyle w:val="Boldphrase"/>
@@ -6649,6 +6578,7 @@
       </w:pPr>
       <w:bookmarkStart w:id="23" w:name="_Toc201668577"/>
       <w:r>
+        <w:lastRenderedPageBreak/>
         <w:t>FieldWorks ICU sorting</w:t>
       </w:r>
       <w:bookmarkEnd w:id="23"/>
@@ -6723,289 +6653,1750 @@
         <w:pStyle w:val="BodyText"/>
       </w:pPr>
       <w:r>
+        <w:t xml:space="preserve">The official Unicode site for storing LDML files is the Unicode Common Locale Data Repository (CLDR, </w:t>
+      </w:r>
+      <w:hyperlink r:id="rId18" w:history="1">
+        <w:r>
+          <w:rPr>
+            <w:rStyle w:val="Hyperlink"/>
+          </w:rPr>
+          <w:t>http://cldr.unicode.org/</w:t>
+        </w:r>
+      </w:hyperlink>
+      <w:r>
+        <w:t>). The SIL Writing System</w:t>
+      </w:r>
+      <w:r>
+        <w:t>s</w:t>
+      </w:r>
+      <w:r>
+        <w:t xml:space="preserve"> Technology Department maintains an SIL Locale Data Repository (</w:t>
+      </w:r>
+      <w:r>
+        <w:t xml:space="preserve">SLDR, </w:t>
+      </w:r>
+      <w:hyperlink r:id="rId19" w:history="1">
+        <w:r>
+          <w:rPr>
+            <w:rStyle w:val="Hyperlink"/>
+          </w:rPr>
+          <w:t>https://github.com/silnrsi/sldr</w:t>
+        </w:r>
+      </w:hyperlink>
+      <w:r>
+        <w:t>), which is very similar to the CLDR, but can be customized for SIL use when needed. A special API is available for programs to access the SLDR</w:t>
+      </w:r>
+      <w:r>
+        <w:t>.</w:t>
+      </w:r>
+      <w:r>
+        <w:t xml:space="preserve"> You can download information using this API in a browser. For example, </w:t>
+      </w:r>
+      <w:hyperlink r:id="rId20" w:history="1">
+        <w:r>
+          <w:rPr>
+            <w:rStyle w:val="Hyperlink"/>
+          </w:rPr>
+          <w:t>https://ldml.api.sil.org/hi</w:t>
+        </w:r>
+      </w:hyperlink>
+      <w:r>
+        <w:t xml:space="preserve"> will download the hi.xml file which can be renamed to </w:t>
+      </w:r>
+      <w:proofErr w:type="spellStart"/>
+      <w:r>
+        <w:t>ldml</w:t>
+      </w:r>
+      <w:proofErr w:type="spellEnd"/>
+      <w:r>
+        <w:t>.</w:t>
+      </w:r>
+      <w:r>
+        <w:t xml:space="preserve"> ICU uses the CLDR. If interested, you can access the raw ICU data from </w:t>
+      </w:r>
+      <w:hyperlink r:id="rId21" w:history="1">
+        <w:r>
+          <w:rPr>
+            <w:rStyle w:val="Hyperlink"/>
+          </w:rPr>
+          <w:t>http://cldr.unicode.org/index/downloads</w:t>
+        </w:r>
+      </w:hyperlink>
+      <w:r>
+        <w:t xml:space="preserve">. Follow the Data link, download the </w:t>
+      </w:r>
+      <w:proofErr w:type="spellStart"/>
+      <w:r>
+        <w:t>cldr</w:t>
+      </w:r>
+      <w:proofErr w:type="spellEnd"/>
+      <w:r>
+        <w:t xml:space="preserve">-common zip file and look in common\collation for the desired </w:t>
+      </w:r>
+      <w:r>
+        <w:t>xml</w:t>
+      </w:r>
+      <w:r>
+        <w:t xml:space="preserve"> file. T</w:t>
+      </w:r>
+      <w:r>
+        <w:t xml:space="preserve">he master list of </w:t>
+      </w:r>
+      <w:r>
+        <w:t>rules</w:t>
+      </w:r>
+      <w:r>
+        <w:t xml:space="preserve"> for ICU code points is in the common\</w:t>
+      </w:r>
+      <w:proofErr w:type="spellStart"/>
+      <w:r>
+        <w:t>uca</w:t>
+      </w:r>
+      <w:proofErr w:type="spellEnd"/>
+      <w:r>
+        <w:t xml:space="preserve">\UCA_Rules.txt file in the </w:t>
+      </w:r>
+      <w:proofErr w:type="spellStart"/>
+      <w:r>
+        <w:t>cldr</w:t>
+      </w:r>
+      <w:proofErr w:type="spellEnd"/>
+      <w:r>
+        <w:t>-common zip file</w:t>
+      </w:r>
+      <w:r>
+        <w:t>.</w:t>
+      </w:r>
+      <w:r>
+        <w:t xml:space="preserve"> The collations element in the </w:t>
+      </w:r>
+      <w:proofErr w:type="spellStart"/>
+      <w:r>
+        <w:t>ldml</w:t>
+      </w:r>
+      <w:proofErr w:type="spellEnd"/>
+      <w:r>
+        <w:t xml:space="preserve"> file may contain multiple collation elements. FieldWorks </w:t>
+      </w:r>
+      <w:r>
+        <w:t xml:space="preserve">only </w:t>
+      </w:r>
+      <w:r>
+        <w:t xml:space="preserve">uses the standard collation element which can be found by searching for </w:t>
+      </w:r>
+      <w:r>
+        <w:t>&lt;collation type="standard"</w:t>
+      </w:r>
+      <w:r>
+        <w:t>.</w:t>
+      </w:r>
+    </w:p>
+    <w:p>
+      <w:pPr>
+        <w:pStyle w:val="BodyText"/>
+      </w:pPr>
+      <w:r>
+        <w:t>In FieldWorks Version 9,</w:t>
+      </w:r>
+      <w:r>
+        <w:t xml:space="preserve"> the first time </w:t>
+      </w:r>
+      <w:r>
+        <w:t>you add a new writing system</w:t>
+      </w:r>
+      <w:r>
+        <w:t xml:space="preserve"> (e.g., </w:t>
+      </w:r>
+      <w:r>
+        <w:t>Hindi</w:t>
+      </w:r>
+      <w:r>
+        <w:t>)</w:t>
+      </w:r>
+      <w:r>
+        <w:t>, on your machine, and you are connected to the Internet, it will download the hi.</w:t>
+      </w:r>
+      <w:r>
+        <w:t>xml</w:t>
+      </w:r>
+      <w:r>
+        <w:t xml:space="preserve"> file from </w:t>
+      </w:r>
+      <w:r>
+        <w:t xml:space="preserve">the SLDR and store it </w:t>
+      </w:r>
+      <w:r>
+        <w:t>in C</w:t>
+      </w:r>
+      <w:r>
+        <w:t>:\ProgramData\SIL\SldrCache</w:t>
+      </w:r>
+      <w:r>
+        <w:t xml:space="preserve"> as </w:t>
+      </w:r>
+      <w:proofErr w:type="gramStart"/>
+      <w:r>
+        <w:t>an</w:t>
+      </w:r>
+      <w:proofErr w:type="gramEnd"/>
+      <w:r>
+        <w:t xml:space="preserve"> </w:t>
+      </w:r>
+      <w:proofErr w:type="spellStart"/>
+      <w:r>
+        <w:t>ldml</w:t>
+      </w:r>
+      <w:proofErr w:type="spellEnd"/>
+      <w:r>
+        <w:t xml:space="preserve"> file</w:t>
+      </w:r>
+      <w:r>
+        <w:t xml:space="preserve">. </w:t>
+      </w:r>
+      <w:r>
+        <w:t>It then stores this information in</w:t>
+      </w:r>
+      <w:r>
+        <w:t xml:space="preserve"> the project’s </w:t>
+      </w:r>
+      <w:proofErr w:type="spellStart"/>
+      <w:r>
+        <w:t>WritingSystemStore</w:t>
+      </w:r>
+      <w:proofErr w:type="spellEnd"/>
+      <w:r>
+        <w:t xml:space="preserve"> directory, and will</w:t>
+      </w:r>
+      <w:r>
+        <w:t xml:space="preserve"> also</w:t>
+      </w:r>
+      <w:r>
+        <w:t xml:space="preserve"> save a copy in the global </w:t>
+      </w:r>
+      <w:r>
+        <w:t>repository</w:t>
+      </w:r>
+      <w:r>
+        <w:t xml:space="preserve"> for use when other projects</w:t>
+      </w:r>
+      <w:r>
+        <w:t xml:space="preserve"> or programs</w:t>
+      </w:r>
+      <w:r>
+        <w:t xml:space="preserve"> need the information.</w:t>
+      </w:r>
+      <w:r>
+        <w:t xml:space="preserve"> The writing system property dialog displays the collation from the </w:t>
+      </w:r>
+      <w:proofErr w:type="spellStart"/>
+      <w:r>
+        <w:t>ldml</w:t>
+      </w:r>
+      <w:proofErr w:type="spellEnd"/>
+      <w:r>
+        <w:t xml:space="preserve"> file in the Sort tab. </w:t>
+      </w:r>
+      <w:r>
+        <w:t>When you make changes in this tab,</w:t>
+      </w:r>
+      <w:r>
+        <w:t xml:space="preserve"> it</w:t>
+      </w:r>
+      <w:r>
+        <w:t xml:space="preserve"> copies your changes </w:t>
+      </w:r>
+      <w:r>
+        <w:t xml:space="preserve">into the current project </w:t>
+      </w:r>
+      <w:proofErr w:type="spellStart"/>
+      <w:r>
+        <w:t>hi.ldml</w:t>
+      </w:r>
+      <w:proofErr w:type="spellEnd"/>
+      <w:r>
+        <w:t xml:space="preserve"> and also update</w:t>
+      </w:r>
+      <w:r>
+        <w:t>s</w:t>
+      </w:r>
+      <w:r>
+        <w:t xml:space="preserve"> the copy in the global </w:t>
+      </w:r>
+      <w:r>
+        <w:t>repository</w:t>
+      </w:r>
+      <w:r>
+        <w:t xml:space="preserve">, but will not affect the original in </w:t>
+      </w:r>
+      <w:proofErr w:type="spellStart"/>
+      <w:r>
+        <w:t>SldrCache</w:t>
+      </w:r>
+      <w:proofErr w:type="spellEnd"/>
+      <w:r>
+        <w:t>.</w:t>
+      </w:r>
+    </w:p>
+    <w:p>
+      <w:pPr>
+        <w:pStyle w:val="BodyText"/>
+      </w:pPr>
+      <w:r>
+        <w:t xml:space="preserve">In </w:t>
+      </w:r>
+      <w:r>
+        <w:t>FLEx</w:t>
+      </w:r>
+      <w:r>
+        <w:t>, you can choose an option in the Sort tab to use a collation from a standard language, which uses the default definitions built into ICU. If you need to make any adjus</w:t>
+      </w:r>
+      <w:r>
+        <w:t>t</w:t>
+      </w:r>
+      <w:r>
+        <w:t xml:space="preserve">ment to the standard collation, you need to get the ICU rules for </w:t>
+      </w:r>
+      <w:r>
+        <w:t>the</w:t>
+      </w:r>
+      <w:r>
+        <w:t xml:space="preserve"> language and paste them into the Custom ICU rules pane in the Sort tab. Then you can customize these rules in any way you want for your purposes. If </w:t>
+      </w:r>
+      <w:r>
+        <w:t>FLEx</w:t>
+      </w:r>
+      <w:r>
+        <w:t xml:space="preserve"> downloaded the file via the SLDR, the rules for that language will already be in the Custom ICU rules. If you have an existing </w:t>
+      </w:r>
+      <w:proofErr w:type="spellStart"/>
+      <w:r>
+        <w:t>ldml</w:t>
+      </w:r>
+      <w:proofErr w:type="spellEnd"/>
+      <w:r>
+        <w:t xml:space="preserve"> file that does not have the correct rules, you can use one of the resources above to get the current file and copy the rules to your Custom ICU rules dialog.</w:t>
+      </w:r>
+    </w:p>
+    <w:p>
+      <w:pPr>
+        <w:pStyle w:val="Heading1"/>
+      </w:pPr>
+      <w:bookmarkStart w:id="24" w:name="_Toc201668578"/>
+      <w:r>
+        <w:t>Converting Toolbox sort rules to ICU rules</w:t>
+      </w:r>
+      <w:bookmarkEnd w:id="24"/>
+    </w:p>
+    <w:p>
+      <w:pPr>
+        <w:pStyle w:val="BodyText"/>
+      </w:pPr>
+      <w:r>
+        <w:t>Toolbox stores collations in a .</w:t>
+      </w:r>
+      <w:proofErr w:type="spellStart"/>
+      <w:r>
+        <w:t>lng</w:t>
+      </w:r>
+      <w:proofErr w:type="spellEnd"/>
+      <w:r>
+        <w:t xml:space="preserve"> file in the main Toolbox directory. Here is a fairly complex sort specification, where </w:t>
+      </w:r>
+      <w:proofErr w:type="spellStart"/>
+      <w:r>
+        <w:t>cco</w:t>
+      </w:r>
+      <w:proofErr w:type="spellEnd"/>
+      <w:r>
+        <w:t xml:space="preserve"> is the code for the language:</w:t>
+      </w:r>
+    </w:p>
+    <w:p>
+      <w:pPr>
+        <w:pStyle w:val="Example"/>
+      </w:pPr>
+      <w:r>
+        <w:t>\+</w:t>
+      </w:r>
+      <w:proofErr w:type="spellStart"/>
+      <w:r>
+        <w:t>srt</w:t>
+      </w:r>
+      <w:proofErr w:type="spellEnd"/>
+      <w:r>
+        <w:t xml:space="preserve"> </w:t>
+      </w:r>
+      <w:proofErr w:type="spellStart"/>
+      <w:r>
+        <w:t>cco</w:t>
+      </w:r>
+      <w:proofErr w:type="spellEnd"/>
+      <w:r>
+        <w:t xml:space="preserve"> order</w:t>
+      </w:r>
+      <w:r>
+        <w:br/>
+      </w:r>
+      <w:r>
+        <w:t xml:space="preserve">\primary A </w:t>
+      </w:r>
+      <w:proofErr w:type="spellStart"/>
+      <w:r>
+        <w:t>a</w:t>
+      </w:r>
+      <w:proofErr w:type="spellEnd"/>
+      <w:r>
+        <w:t xml:space="preserve"> Á </w:t>
+      </w:r>
+      <w:proofErr w:type="spellStart"/>
+      <w:r>
+        <w:t>á</w:t>
+      </w:r>
+      <w:proofErr w:type="spellEnd"/>
+      <w:r>
+        <w:t xml:space="preserve"> A̱ a̱ Á̱ á̱</w:t>
+      </w:r>
+      <w:r>
+        <w:br/>
+      </w:r>
+      <w:r>
         <w:lastRenderedPageBreak/>
-        <w:t xml:space="preserve">The official Unicode site for storing LDML files is the Unicode Common Locale Data Repository (CLDR, </w:t>
-      </w:r>
-      <w:hyperlink r:id="rId18" w:history="1">
-        <w:r>
-          <w:rPr>
-            <w:rStyle w:val="Hyperlink"/>
-          </w:rPr>
-          <w:t>http://cldr.unicode.org/</w:t>
-        </w:r>
-      </w:hyperlink>
-      <w:r>
-        <w:t>). The SIL Writing System</w:t>
-      </w:r>
+        <w:t xml:space="preserve">B </w:t>
+      </w:r>
+      <w:proofErr w:type="spellStart"/>
+      <w:r>
+        <w:t>b</w:t>
+      </w:r>
+      <w:proofErr w:type="spellEnd"/>
+      <w:r>
+        <w:br/>
+      </w:r>
+      <w:r>
+        <w:t xml:space="preserve">C </w:t>
+      </w:r>
+      <w:proofErr w:type="spellStart"/>
+      <w:r>
+        <w:t>c</w:t>
+      </w:r>
+      <w:proofErr w:type="spellEnd"/>
+      <w:r>
+        <w:t xml:space="preserve"> </w:t>
+      </w:r>
+      <w:r>
+        <w:br/>
+      </w:r>
+      <w:r>
+        <w:t xml:space="preserve">Ch </w:t>
+      </w:r>
+      <w:proofErr w:type="spellStart"/>
+      <w:r>
+        <w:t>ch</w:t>
+      </w:r>
+      <w:proofErr w:type="spellEnd"/>
+      <w:r>
+        <w:br/>
+      </w:r>
+      <w:r>
+        <w:t xml:space="preserve">D </w:t>
+      </w:r>
+      <w:proofErr w:type="spellStart"/>
+      <w:r>
+        <w:t>d</w:t>
+      </w:r>
+      <w:proofErr w:type="spellEnd"/>
+      <w:r>
+        <w:br/>
+      </w:r>
+      <w:r>
+        <w:t xml:space="preserve">E </w:t>
+      </w:r>
+      <w:proofErr w:type="spellStart"/>
+      <w:r>
+        <w:t>e</w:t>
+      </w:r>
+      <w:proofErr w:type="spellEnd"/>
+      <w:r>
+        <w:t xml:space="preserve"> É </w:t>
+      </w:r>
+      <w:proofErr w:type="spellStart"/>
+      <w:r>
+        <w:t>é</w:t>
+      </w:r>
+      <w:proofErr w:type="spellEnd"/>
+      <w:r>
+        <w:t xml:space="preserve"> E̱ e̱ É̱ é̱</w:t>
+      </w:r>
+      <w:r>
+        <w:br/>
+      </w:r>
+      <w:r>
+        <w:t xml:space="preserve">F </w:t>
+      </w:r>
+      <w:proofErr w:type="spellStart"/>
+      <w:r>
+        <w:t>f</w:t>
+      </w:r>
+      <w:proofErr w:type="spellEnd"/>
+      <w:r>
+        <w:br/>
+      </w:r>
+      <w:r>
+        <w:t xml:space="preserve">G </w:t>
+      </w:r>
+      <w:proofErr w:type="spellStart"/>
+      <w:r>
+        <w:t>g</w:t>
+      </w:r>
+      <w:proofErr w:type="spellEnd"/>
+      <w:r>
+        <w:t xml:space="preserve"> </w:t>
+      </w:r>
+      <w:proofErr w:type="spellStart"/>
+      <w:r>
+        <w:t>gu</w:t>
+      </w:r>
+      <w:proofErr w:type="spellEnd"/>
+      <w:r>
+        <w:t xml:space="preserve"> </w:t>
+      </w:r>
+      <w:proofErr w:type="spellStart"/>
+      <w:r>
+        <w:t>gü</w:t>
+      </w:r>
+      <w:proofErr w:type="spellEnd"/>
+      <w:r>
+        <w:br/>
+      </w:r>
+      <w:r>
+        <w:t>ꞌG ꞌg</w:t>
+      </w:r>
+      <w:r>
+        <w:br/>
+      </w:r>
+      <w:r>
+        <w:t xml:space="preserve">H </w:t>
+      </w:r>
+      <w:proofErr w:type="spellStart"/>
+      <w:r>
+        <w:t>h</w:t>
+      </w:r>
+      <w:proofErr w:type="spellEnd"/>
+      <w:r>
+        <w:br/>
+      </w:r>
+      <w:r>
+        <w:t xml:space="preserve">I </w:t>
+      </w:r>
+      <w:proofErr w:type="spellStart"/>
+      <w:r>
+        <w:t>i</w:t>
+      </w:r>
+      <w:proofErr w:type="spellEnd"/>
+      <w:r>
+        <w:t xml:space="preserve"> Í </w:t>
+      </w:r>
+      <w:proofErr w:type="spellStart"/>
+      <w:r>
+        <w:t>í</w:t>
+      </w:r>
+      <w:proofErr w:type="spellEnd"/>
+      <w:r>
+        <w:t xml:space="preserve"> I̱ </w:t>
+      </w:r>
+      <w:proofErr w:type="spellStart"/>
+      <w:r>
+        <w:t>i</w:t>
+      </w:r>
+      <w:proofErr w:type="spellEnd"/>
+      <w:r>
+        <w:t>̱ Í̱ í̱</w:t>
+      </w:r>
+      <w:r>
+        <w:br/>
+      </w:r>
+      <w:r>
+        <w:t xml:space="preserve">Ɨ </w:t>
+      </w:r>
+      <w:proofErr w:type="spellStart"/>
+      <w:r>
+        <w:t>ɨ</w:t>
+      </w:r>
+      <w:proofErr w:type="spellEnd"/>
+      <w:r>
+        <w:t xml:space="preserve"> </w:t>
+      </w:r>
+      <w:proofErr w:type="spellStart"/>
+      <w:r>
+        <w:t>Ɨ</w:t>
+      </w:r>
+      <w:proofErr w:type="spellEnd"/>
+      <w:r>
+        <w:t>́ ɨ́ Ɨ̱ ɨ̱ Ɨ̱́ ɨ̱́</w:t>
+      </w:r>
+      <w:r>
+        <w:br/>
+      </w:r>
+      <w:r>
+        <w:t xml:space="preserve">J </w:t>
+      </w:r>
+      <w:proofErr w:type="spellStart"/>
+      <w:r>
+        <w:t>j</w:t>
+      </w:r>
+      <w:proofErr w:type="spellEnd"/>
+      <w:r>
+        <w:br/>
+      </w:r>
+      <w:r>
+        <w:t xml:space="preserve">K </w:t>
+      </w:r>
+      <w:proofErr w:type="spellStart"/>
+      <w:r>
+        <w:t>k</w:t>
+      </w:r>
+      <w:proofErr w:type="spellEnd"/>
+      <w:r>
+        <w:br/>
+      </w:r>
+      <w:r>
+        <w:t xml:space="preserve">L </w:t>
+      </w:r>
+      <w:proofErr w:type="spellStart"/>
+      <w:r>
+        <w:t>l</w:t>
+      </w:r>
+      <w:proofErr w:type="spellEnd"/>
+      <w:r>
+        <w:br/>
+      </w:r>
+      <w:r>
+        <w:t>ꞌL ꞌl</w:t>
+      </w:r>
+      <w:r>
+        <w:br/>
+      </w:r>
+      <w:r>
+        <w:t xml:space="preserve">M </w:t>
+      </w:r>
+      <w:proofErr w:type="spellStart"/>
+      <w:r>
+        <w:t>m</w:t>
+      </w:r>
+      <w:proofErr w:type="spellEnd"/>
+      <w:r>
+        <w:br/>
+      </w:r>
+      <w:r>
+        <w:t>ꞌM ꞌm</w:t>
+      </w:r>
+      <w:r>
+        <w:br/>
+      </w:r>
+      <w:r>
+        <w:t xml:space="preserve">N </w:t>
+      </w:r>
+      <w:proofErr w:type="spellStart"/>
+      <w:r>
+        <w:t>n</w:t>
+      </w:r>
+      <w:proofErr w:type="spellEnd"/>
+      <w:r>
+        <w:br/>
+      </w:r>
+      <w:r>
+        <w:t>ꞌN ꞌn</w:t>
+      </w:r>
+      <w:r>
+        <w:br/>
+      </w:r>
+      <w:r>
+        <w:t xml:space="preserve">Ñ </w:t>
+      </w:r>
+      <w:proofErr w:type="spellStart"/>
+      <w:r>
+        <w:t>ñ</w:t>
+      </w:r>
+      <w:proofErr w:type="spellEnd"/>
+      <w:r>
+        <w:br/>
+      </w:r>
+      <w:r>
+        <w:t>ꞌÑ ꞌñ</w:t>
+      </w:r>
+      <w:r>
+        <w:br/>
+      </w:r>
+      <w:r>
+        <w:t xml:space="preserve">O </w:t>
+      </w:r>
+      <w:proofErr w:type="spellStart"/>
+      <w:r>
+        <w:t>o</w:t>
+      </w:r>
+      <w:proofErr w:type="spellEnd"/>
+      <w:r>
+        <w:t xml:space="preserve"> Ó </w:t>
+      </w:r>
+      <w:proofErr w:type="spellStart"/>
+      <w:r>
+        <w:t>ó</w:t>
+      </w:r>
+      <w:proofErr w:type="spellEnd"/>
+      <w:r>
+        <w:t xml:space="preserve"> O̱ o̱ Ó̱ ó̱</w:t>
+      </w:r>
+      <w:r>
+        <w:br/>
+      </w:r>
+      <w:r>
+        <w:t xml:space="preserve">Ø </w:t>
+      </w:r>
+      <w:proofErr w:type="spellStart"/>
+      <w:r>
+        <w:t>ø</w:t>
+      </w:r>
+      <w:proofErr w:type="spellEnd"/>
+      <w:r>
+        <w:t xml:space="preserve"> Ǿ </w:t>
+      </w:r>
+      <w:proofErr w:type="spellStart"/>
+      <w:r>
+        <w:t>ǿ</w:t>
+      </w:r>
+      <w:proofErr w:type="spellEnd"/>
+      <w:r>
+        <w:t xml:space="preserve"> Ø̱ ø̱ Ǿ̱ ǿ̱ </w:t>
+      </w:r>
+      <w:r>
+        <w:br/>
+      </w:r>
+      <w:r>
+        <w:t xml:space="preserve">P </w:t>
+      </w:r>
+      <w:proofErr w:type="spellStart"/>
+      <w:r>
+        <w:t>p</w:t>
+      </w:r>
+      <w:proofErr w:type="spellEnd"/>
+      <w:r>
+        <w:br/>
+      </w:r>
+      <w:r>
+        <w:t xml:space="preserve">Q </w:t>
+      </w:r>
+      <w:proofErr w:type="spellStart"/>
+      <w:r>
+        <w:t>q</w:t>
+      </w:r>
+      <w:proofErr w:type="spellEnd"/>
+      <w:r>
+        <w:br/>
+      </w:r>
+      <w:r>
+        <w:t xml:space="preserve">R </w:t>
+      </w:r>
+      <w:proofErr w:type="spellStart"/>
+      <w:r>
+        <w:t>r</w:t>
+      </w:r>
+      <w:proofErr w:type="spellEnd"/>
+      <w:r>
+        <w:br/>
+      </w:r>
+      <w:r>
+        <w:t xml:space="preserve">S </w:t>
+      </w:r>
+      <w:proofErr w:type="spellStart"/>
       <w:r>
         <w:t>s</w:t>
       </w:r>
-      <w:r>
-        <w:t xml:space="preserve"> Technology Department maintains an SIL Locale Data Repository (</w:t>
-      </w:r>
-      <w:r>
-        <w:t xml:space="preserve">SLDR, </w:t>
-      </w:r>
-      <w:hyperlink r:id="rId19" w:history="1">
-        <w:r>
-          <w:rPr>
-            <w:rStyle w:val="Hyperlink"/>
-          </w:rPr>
-          <w:t>https://github.com/silnrsi/sldr</w:t>
-        </w:r>
-      </w:hyperlink>
-      <w:r>
-        <w:t>), which is very similar to the CLDR, but can be customized for SIL use when needed. A special API is available for programs to access the SLDR</w:t>
+      <w:proofErr w:type="spellEnd"/>
+      <w:r>
+        <w:br/>
+      </w:r>
+      <w:r>
+        <w:t xml:space="preserve">T </w:t>
+      </w:r>
+      <w:proofErr w:type="spellStart"/>
+      <w:r>
+        <w:t>t</w:t>
+      </w:r>
+      <w:proofErr w:type="spellEnd"/>
+      <w:r>
+        <w:br/>
+      </w:r>
+      <w:r>
+        <w:t xml:space="preserve">U </w:t>
+      </w:r>
+      <w:proofErr w:type="spellStart"/>
+      <w:r>
+        <w:t>u</w:t>
+      </w:r>
+      <w:proofErr w:type="spellEnd"/>
+      <w:r>
+        <w:t xml:space="preserve"> Ú </w:t>
+      </w:r>
+      <w:proofErr w:type="spellStart"/>
+      <w:r>
+        <w:t>ú</w:t>
+      </w:r>
+      <w:proofErr w:type="spellEnd"/>
+      <w:r>
+        <w:t xml:space="preserve"> U̱ u̱ Ú̱ ú̱ ü</w:t>
+      </w:r>
+      <w:r>
+        <w:br/>
+      </w:r>
+      <w:r>
+        <w:t>Ʉ ʉ Ʉ́ ʉ́ Ʉ̱ ʉ̱ Ʉ̱́ ʉ̱́</w:t>
+      </w:r>
+      <w:r>
+        <w:br/>
+      </w:r>
+      <w:r>
+        <w:t xml:space="preserve">V </w:t>
+      </w:r>
+      <w:proofErr w:type="spellStart"/>
+      <w:r>
+        <w:t>v</w:t>
+      </w:r>
+      <w:proofErr w:type="spellEnd"/>
+      <w:r>
+        <w:br/>
+      </w:r>
+      <w:r>
+        <w:t xml:space="preserve">W </w:t>
+      </w:r>
+      <w:proofErr w:type="spellStart"/>
+      <w:r>
+        <w:t>w</w:t>
+      </w:r>
+      <w:proofErr w:type="spellEnd"/>
+      <w:r>
+        <w:br/>
+      </w:r>
+      <w:r>
+        <w:t xml:space="preserve">X </w:t>
+      </w:r>
+      <w:proofErr w:type="spellStart"/>
+      <w:r>
+        <w:t>x</w:t>
+      </w:r>
+      <w:proofErr w:type="spellEnd"/>
+      <w:r>
+        <w:br/>
+      </w:r>
+      <w:r>
+        <w:t xml:space="preserve">Y </w:t>
+      </w:r>
+      <w:proofErr w:type="spellStart"/>
+      <w:r>
+        <w:t>y</w:t>
+      </w:r>
+      <w:proofErr w:type="spellEnd"/>
+      <w:r>
+        <w:br/>
+      </w:r>
+      <w:r>
+        <w:t xml:space="preserve">Z </w:t>
+      </w:r>
+      <w:proofErr w:type="spellStart"/>
+      <w:r>
+        <w:t>z</w:t>
+      </w:r>
+      <w:proofErr w:type="spellEnd"/>
+      <w:r>
+        <w:br/>
+      </w:r>
+      <w:r>
+        <w:t>ꞌ</w:t>
+      </w:r>
+      <w:r>
+        <w:br/>
+      </w:r>
+      <w:r>
+        <w:t>0</w:t>
+      </w:r>
+      <w:r>
+        <w:br/>
+      </w:r>
+      <w:r>
+        <w:t>1</w:t>
+      </w:r>
+      <w:r>
+        <w:br/>
+      </w:r>
+      <w:r>
+        <w:t>2</w:t>
+      </w:r>
+      <w:r>
+        <w:br/>
+      </w:r>
+      <w:r>
+        <w:t>3</w:t>
+      </w:r>
+      <w:r>
+        <w:br/>
+      </w:r>
+      <w:r>
+        <w:t>4</w:t>
+      </w:r>
+      <w:r>
+        <w:br/>
+      </w:r>
+      <w:r>
+        <w:t>5</w:t>
+      </w:r>
+      <w:r>
+        <w:br/>
+      </w:r>
+      <w:r>
+        <w:t>6</w:t>
+      </w:r>
+      <w:r>
+        <w:br/>
+      </w:r>
+      <w:r>
+        <w:t>7</w:t>
+      </w:r>
+      <w:r>
+        <w:br/>
+      </w:r>
+      <w:r>
+        <w:t>8</w:t>
+      </w:r>
+      <w:r>
+        <w:br/>
+      </w:r>
+      <w:r>
+        <w:t>9</w:t>
+      </w:r>
+      <w:r>
+        <w:br/>
+      </w:r>
+      <w:r>
+        <w:rPr>
+          <w:rFonts w:hint="eastAsia"/>
+        </w:rPr>
+        <w:lastRenderedPageBreak/>
+        <w:t>\</w:t>
+      </w:r>
+      <w:proofErr w:type="spellStart"/>
+      <w:r>
+        <w:rPr>
+          <w:rFonts w:hint="eastAsia"/>
+        </w:rPr>
+        <w:t>SecFollowing</w:t>
+      </w:r>
+      <w:proofErr w:type="spellEnd"/>
+      <w:r>
+        <w:rPr>
+          <w:rFonts w:hint="eastAsia"/>
+        </w:rPr>
+        <w:t xml:space="preserve"> </w:t>
+      </w:r>
+      <w:r>
+        <w:rPr>
+          <w:rFonts w:hint="eastAsia"/>
+        </w:rPr>
+        <w:t>ˋ</w:t>
+      </w:r>
+      <w:r>
+        <w:rPr>
+          <w:rFonts w:hint="eastAsia"/>
+        </w:rPr>
+        <w:t xml:space="preserve"> </w:t>
+      </w:r>
+      <w:r>
+        <w:rPr>
+          <w:rFonts w:hint="eastAsia"/>
+        </w:rPr>
+        <w:t>¯</w:t>
+      </w:r>
+      <w:r>
+        <w:rPr>
+          <w:rFonts w:hint="eastAsia"/>
+        </w:rPr>
+        <w:t xml:space="preserve"> </w:t>
+      </w:r>
+      <w:r>
+        <w:rPr>
+          <w:rFonts w:hint="eastAsia"/>
+        </w:rPr>
+        <w:t>ˆ</w:t>
+      </w:r>
+      <w:r>
+        <w:rPr>
+          <w:rFonts w:hint="eastAsia"/>
+        </w:rPr>
+        <w:t xml:space="preserve"> </w:t>
+      </w:r>
+      <w:r>
+        <w:rPr>
+          <w:rFonts w:hint="eastAsia"/>
+        </w:rPr>
+        <w:t>ˊ</w:t>
+      </w:r>
+      <w:r>
+        <w:rPr>
+          <w:rFonts w:hint="eastAsia"/>
+        </w:rPr>
+        <w:t xml:space="preserve"> </w:t>
+      </w:r>
+      <w:r>
+        <w:rPr>
+          <w:rFonts w:hint="eastAsia"/>
+        </w:rPr>
+        <w:t>˜</w:t>
+      </w:r>
+      <w:r>
+        <w:rPr>
+          <w:rFonts w:hint="eastAsia"/>
+        </w:rPr>
+        <w:t xml:space="preserve"> </w:t>
+      </w:r>
+      <w:r>
+        <w:rPr>
+          <w:rFonts w:hint="eastAsia"/>
+        </w:rPr>
+        <w:t>ˇ</w:t>
+      </w:r>
+      <w:r>
+        <w:br/>
+      </w:r>
+      <w:r>
+        <w:t>\ignore _ - =</w:t>
+      </w:r>
+      <w:r>
+        <w:br/>
+      </w:r>
+      <w:r>
+        <w:t>\</w:t>
+      </w:r>
+      <w:proofErr w:type="spellStart"/>
+      <w:r>
+        <w:t>SecAfterBase</w:t>
+      </w:r>
+      <w:proofErr w:type="spellEnd"/>
+      <w:r>
+        <w:br/>
+      </w:r>
+      <w:r>
+        <w:t>\-</w:t>
+      </w:r>
+      <w:proofErr w:type="spellStart"/>
+      <w:r>
+        <w:t>srt</w:t>
+      </w:r>
+      <w:proofErr w:type="spellEnd"/>
+      <w:r>
+        <w:br/>
+      </w:r>
+      <w:r>
+        <w:br/>
+      </w:r>
+      <w:r>
+        <w:t>\</w:t>
+      </w:r>
+      <w:proofErr w:type="spellStart"/>
+      <w:r>
+        <w:t>SecPreceding</w:t>
+      </w:r>
+      <w:proofErr w:type="spellEnd"/>
+      <w:r>
+        <w:br/>
+      </w:r>
+      <w:r>
+        <w:t>\</w:t>
+      </w:r>
+      <w:proofErr w:type="spellStart"/>
+      <w:r>
+        <w:t>SecAfterBase</w:t>
+      </w:r>
+      <w:proofErr w:type="spellEnd"/>
+    </w:p>
+    <w:p>
+      <w:pPr>
+        <w:pStyle w:val="BodyText"/>
+      </w:pPr>
+      <w:r>
+        <w:t>The \primary section lists characters with primary distinctions starting on a new line and secondary distinctions on the same line separated by spaces. Every character and digraph needs to be included.</w:t>
+      </w:r>
+    </w:p>
+    <w:p>
+      <w:pPr>
+        <w:pStyle w:val="BodyText"/>
+      </w:pPr>
+      <w:r>
+        <w:t>FLEx</w:t>
+      </w:r>
+      <w:r>
+        <w:t xml:space="preserve"> use</w:t>
+      </w:r>
+      <w:r>
+        <w:t xml:space="preserve">s ICU for specifying collation, and </w:t>
+      </w:r>
+      <w:r>
+        <w:t xml:space="preserve">ICU defines a default Unicode order for every character. Often this order is correct. You </w:t>
+      </w:r>
+      <w:r>
+        <w:t>could</w:t>
+      </w:r>
+      <w:r>
+        <w:t xml:space="preserve"> specify rules for every character if you want, but it's simpler to only list rules for characters that do not sort properly by default. Suppose Toolbox has this order:</w:t>
+      </w:r>
+    </w:p>
+    <w:p>
+      <w:pPr>
+        <w:pStyle w:val="Example"/>
+      </w:pPr>
+      <w:r>
+        <w:t xml:space="preserve">\primary A </w:t>
+      </w:r>
+      <w:proofErr w:type="spellStart"/>
+      <w:r>
+        <w:t>a</w:t>
+      </w:r>
+      <w:proofErr w:type="spellEnd"/>
+      <w:r>
+        <w:t xml:space="preserve"> Á </w:t>
+      </w:r>
+      <w:proofErr w:type="spellStart"/>
+      <w:r>
+        <w:t>á</w:t>
+      </w:r>
+      <w:proofErr w:type="spellEnd"/>
+      <w:r>
+        <w:br/>
+      </w:r>
+      <w:r>
+        <w:t xml:space="preserve">B </w:t>
+      </w:r>
+      <w:proofErr w:type="spellStart"/>
+      <w:r>
+        <w:t>b</w:t>
+      </w:r>
+      <w:proofErr w:type="spellEnd"/>
+      <w:r>
+        <w:br/>
+      </w:r>
+      <w:r>
+        <w:t xml:space="preserve">C </w:t>
+      </w:r>
+      <w:proofErr w:type="spellStart"/>
+      <w:r>
+        <w:t>c</w:t>
+      </w:r>
+      <w:proofErr w:type="spellEnd"/>
+      <w:r>
+        <w:t xml:space="preserve"> </w:t>
+      </w:r>
+      <w:r>
+        <w:br/>
+      </w:r>
+      <w:r>
+        <w:t xml:space="preserve">Ch </w:t>
+      </w:r>
+      <w:proofErr w:type="spellStart"/>
+      <w:r>
+        <w:t>ch</w:t>
+      </w:r>
+      <w:proofErr w:type="spellEnd"/>
+    </w:p>
+    <w:p>
+      <w:pPr>
+        <w:pStyle w:val="BodyText"/>
+      </w:pPr>
+      <w:r>
+        <w:t>a, b, c is already the default order, so we don't need to specify rules for that. We don't need to list composed character/diacritic letters in F</w:t>
+      </w:r>
+      <w:r>
+        <w:t>LE</w:t>
+      </w:r>
+      <w:r>
+        <w:t xml:space="preserve">x because internally it uses decomposed form </w:t>
+      </w:r>
+      <w:r>
+        <w:t xml:space="preserve">(NFD) </w:t>
+      </w:r>
+      <w:r>
+        <w:t xml:space="preserve">where the diacritic is a separate </w:t>
+      </w:r>
+      <w:r>
+        <w:t>code point</w:t>
+      </w:r>
+      <w:r>
+        <w:t xml:space="preserve"> after the vowel. Since diacritics sort after vowels using secondary ordering by default, we don't need to include them in collation rules unless you need an order different from the ICU default. </w:t>
+      </w:r>
+      <w:proofErr w:type="gramStart"/>
+      <w:r>
+        <w:t>So</w:t>
+      </w:r>
+      <w:proofErr w:type="gramEnd"/>
+      <w:r>
+        <w:t xml:space="preserve"> the only exception to defaults in this case is the </w:t>
+      </w:r>
+      <w:proofErr w:type="spellStart"/>
+      <w:r>
+        <w:t>ch</w:t>
+      </w:r>
+      <w:proofErr w:type="spellEnd"/>
+      <w:r>
+        <w:t xml:space="preserve"> digraph. </w:t>
+      </w:r>
+      <w:proofErr w:type="gramStart"/>
+      <w:r>
+        <w:t>So</w:t>
+      </w:r>
+      <w:proofErr w:type="gramEnd"/>
+      <w:r>
+        <w:t xml:space="preserve"> all we need is a rule to specify that the </w:t>
+      </w:r>
+      <w:r>
+        <w:t>“</w:t>
+      </w:r>
+      <w:proofErr w:type="spellStart"/>
+      <w:r>
+        <w:t>ch</w:t>
+      </w:r>
+      <w:proofErr w:type="spellEnd"/>
+      <w:r>
+        <w:t>”</w:t>
+      </w:r>
+      <w:r>
+        <w:t xml:space="preserve"> digraph comes after </w:t>
+      </w:r>
+      <w:r>
+        <w:t>“</w:t>
+      </w:r>
+      <w:r>
+        <w:t>c</w:t>
+      </w:r>
+      <w:r>
+        <w:t>”</w:t>
+      </w:r>
+      <w:r>
+        <w:t xml:space="preserve"> with primary </w:t>
+      </w:r>
+      <w:r>
+        <w:t>ordering</w:t>
       </w:r>
       <w:r>
         <w:t>.</w:t>
       </w:r>
-      <w:r>
-        <w:t xml:space="preserve"> You can download information using this API in a browser. For example, </w:t>
-      </w:r>
-      <w:hyperlink r:id="rId20" w:history="1">
-        <w:r>
-          <w:rPr>
-            <w:rStyle w:val="Hyperlink"/>
-          </w:rPr>
-          <w:t>https://ldml.api.sil.org/hi</w:t>
-        </w:r>
-      </w:hyperlink>
-      <w:r>
-        <w:t xml:space="preserve"> will download the hi.xml file which can be renamed to </w:t>
-      </w:r>
-      <w:proofErr w:type="spellStart"/>
-      <w:r>
-        <w:t>ldml</w:t>
-      </w:r>
-      <w:proofErr w:type="spellEnd"/>
+    </w:p>
+    <w:p>
+      <w:pPr>
+        <w:pStyle w:val="Example"/>
+      </w:pPr>
+      <w:r>
+        <w:t xml:space="preserve">&amp;c &lt; </w:t>
+      </w:r>
+      <w:proofErr w:type="spellStart"/>
+      <w:r>
+        <w:t>ch</w:t>
+      </w:r>
+      <w:proofErr w:type="spellEnd"/>
+      <w:r>
+        <w:t xml:space="preserve"> &lt;&lt;&lt; Ch</w:t>
+      </w:r>
+    </w:p>
+    <w:p>
+      <w:pPr>
+        <w:pStyle w:val="BodyText"/>
+      </w:pPr>
+      <w:r>
+        <w:t xml:space="preserve">One difference in the typical Toolbox sorting and ICU sorting is that Toolbox typically has uppercase letters coming before lowercase letters while ICU defaults to uppercase letters following lowercase letters using tertiary ordering. There is a single rule that tells ICU to put uppercase first regardless of how it is specified in the tertiary rules. By using this rule, you don't have to specify each combination of UC/LC as is needed in Toolbox. In </w:t>
+      </w:r>
+      <w:r>
+        <w:t>FLEx</w:t>
+      </w:r>
+      <w:r>
+        <w:t>,</w:t>
+      </w:r>
+      <w:r>
+        <w:t xml:space="preserve"> the </w:t>
+      </w:r>
+      <w:r>
+        <w:t>letter heading</w:t>
+      </w:r>
+      <w:r>
+        <w:t>s work more reliably if we use default LC first rules and add this command at the beginning to tell ICU to use the opposite case order. So now our final collation for the above simple sample is</w:t>
+      </w:r>
+    </w:p>
+    <w:p>
+      <w:pPr>
+        <w:pStyle w:val="Example"/>
+      </w:pPr>
+      <w:r>
+        <w:t>[</w:t>
+      </w:r>
+      <w:proofErr w:type="spellStart"/>
+      <w:r>
+        <w:t>caseFirst</w:t>
+      </w:r>
+      <w:proofErr w:type="spellEnd"/>
+      <w:r>
+        <w:t xml:space="preserve"> upper]</w:t>
+      </w:r>
+      <w:r>
+        <w:br/>
+      </w:r>
+      <w:r>
+        <w:t xml:space="preserve">&amp;c &lt; </w:t>
+      </w:r>
+      <w:proofErr w:type="spellStart"/>
+      <w:r>
+        <w:t>ch</w:t>
+      </w:r>
+      <w:proofErr w:type="spellEnd"/>
+      <w:r>
+        <w:t xml:space="preserve"> &lt;&lt;&lt; Ch</w:t>
+      </w:r>
+    </w:p>
+    <w:p>
+      <w:pPr>
+        <w:pStyle w:val="BodyText"/>
+      </w:pPr>
+      <w:r>
+        <w:t>If Toolbo</w:t>
+      </w:r>
+      <w:r>
+        <w:t>x has a secondary sort for a di</w:t>
+      </w:r>
+      <w:r>
+        <w:t>graph as with this line</w:t>
+      </w:r>
+    </w:p>
+    <w:p>
+      <w:pPr>
+        <w:pStyle w:val="Example"/>
+      </w:pPr>
+      <w:r>
+        <w:t xml:space="preserve">G </w:t>
+      </w:r>
+      <w:proofErr w:type="spellStart"/>
+      <w:r>
+        <w:t>g</w:t>
+      </w:r>
+      <w:proofErr w:type="spellEnd"/>
+      <w:r>
+        <w:t xml:space="preserve"> </w:t>
+      </w:r>
+      <w:proofErr w:type="spellStart"/>
+      <w:r>
+        <w:t>gu</w:t>
+      </w:r>
+      <w:proofErr w:type="spellEnd"/>
+    </w:p>
+    <w:p>
+      <w:pPr>
+        <w:pStyle w:val="BodyText"/>
+      </w:pPr>
+      <w:r>
+        <w:t xml:space="preserve">then this can be replaced with this ICU rule which specifies </w:t>
+      </w:r>
+      <w:proofErr w:type="spellStart"/>
+      <w:r>
+        <w:t>gu</w:t>
+      </w:r>
+      <w:proofErr w:type="spellEnd"/>
+      <w:r>
+        <w:t xml:space="preserve"> is a secondary ordering after g instead of primary.</w:t>
+      </w:r>
+    </w:p>
+    <w:p>
+      <w:pPr>
+        <w:pStyle w:val="Example"/>
+      </w:pPr>
+      <w:r>
+        <w:t xml:space="preserve">&amp;g &lt;&lt; </w:t>
+      </w:r>
+      <w:proofErr w:type="spellStart"/>
+      <w:r>
+        <w:t>gu</w:t>
+      </w:r>
+      <w:proofErr w:type="spellEnd"/>
+    </w:p>
+    <w:p>
+      <w:pPr>
+        <w:pStyle w:val="BodyText"/>
+      </w:pPr>
+      <w:r>
+        <w:lastRenderedPageBreak/>
+        <w:t>If Toolbox has a combination of secondary and primary ordering following a standard alphabetic character like this</w:t>
+      </w:r>
+    </w:p>
+    <w:p>
+      <w:pPr>
+        <w:pStyle w:val="Example"/>
+      </w:pPr>
+      <w:r>
+        <w:t xml:space="preserve">G </w:t>
+      </w:r>
+      <w:proofErr w:type="spellStart"/>
+      <w:r>
+        <w:t>g</w:t>
+      </w:r>
+      <w:proofErr w:type="spellEnd"/>
+      <w:r>
+        <w:t xml:space="preserve"> </w:t>
+      </w:r>
+      <w:proofErr w:type="spellStart"/>
+      <w:r>
+        <w:t>gu</w:t>
+      </w:r>
+      <w:proofErr w:type="spellEnd"/>
+      <w:r>
+        <w:t xml:space="preserve"> </w:t>
+      </w:r>
+      <w:proofErr w:type="spellStart"/>
+      <w:r>
+        <w:t>gü</w:t>
+      </w:r>
+      <w:proofErr w:type="spellEnd"/>
+      <w:r>
+        <w:br/>
+      </w:r>
+      <w:r>
+        <w:t>ꞌG ꞌg</w:t>
+      </w:r>
+    </w:p>
+    <w:p>
+      <w:pPr>
+        <w:pStyle w:val="BodyText"/>
+      </w:pPr>
+      <w:r>
+        <w:t>then you could use this ICU rule</w:t>
+      </w:r>
+    </w:p>
+    <w:p>
+      <w:pPr>
+        <w:pStyle w:val="Example"/>
+      </w:pPr>
+      <w:r>
+        <w:t xml:space="preserve">&amp; g &lt;&lt; </w:t>
+      </w:r>
+      <w:proofErr w:type="spellStart"/>
+      <w:r>
+        <w:t>gu</w:t>
+      </w:r>
+      <w:proofErr w:type="spellEnd"/>
+      <w:r>
+        <w:t xml:space="preserve"> &lt;&lt; </w:t>
+      </w:r>
+      <w:proofErr w:type="spellStart"/>
+      <w:r>
+        <w:t>gü</w:t>
+      </w:r>
+      <w:proofErr w:type="spellEnd"/>
+      <w:r>
+        <w:t xml:space="preserve"> &lt; ꞌg &lt;&lt;&lt; ꞌG</w:t>
+      </w:r>
+    </w:p>
+    <w:p>
+      <w:pPr>
+        <w:pStyle w:val="BodyText"/>
+      </w:pPr>
+      <w:r>
+        <w:t>This uses “</w:t>
+      </w:r>
+      <w:r>
+        <w:t>&lt;</w:t>
+      </w:r>
+      <w:r>
+        <w:t>”</w:t>
+      </w:r>
+      <w:r>
+        <w:t xml:space="preserve"> for every primary relation </w:t>
+      </w:r>
+      <w:r>
+        <w:t xml:space="preserve">(new line in a Toolbox specification) </w:t>
+      </w:r>
+      <w:r>
+        <w:t xml:space="preserve">and </w:t>
+      </w:r>
+      <w:r>
+        <w:t>“</w:t>
+      </w:r>
+      <w:r>
+        <w:t>&lt;&lt;</w:t>
+      </w:r>
+      <w:r>
+        <w:t>”</w:t>
+      </w:r>
+      <w:r>
+        <w:t xml:space="preserve"> for secondary</w:t>
+      </w:r>
+      <w:r>
+        <w:t xml:space="preserve"> (following space in a Toolbox specification)</w:t>
+      </w:r>
+      <w:r>
+        <w:t xml:space="preserve">, and </w:t>
+      </w:r>
+      <w:r>
+        <w:t>“</w:t>
+      </w:r>
+      <w:r>
+        <w:t>&lt;&lt;&lt;</w:t>
+      </w:r>
+      <w:r>
+        <w:t>”</w:t>
+      </w:r>
+      <w:r>
+        <w:t xml:space="preserve"> for tertiary</w:t>
+      </w:r>
+      <w:r>
+        <w:t xml:space="preserve"> to handle uppercase</w:t>
+      </w:r>
       <w:r>
         <w:t>.</w:t>
       </w:r>
-      <w:r>
-        <w:t xml:space="preserve"> ICU uses the CLDR. If interested, you can access the raw ICU data from </w:t>
-      </w:r>
-      <w:hyperlink r:id="rId21" w:history="1">
-        <w:r>
-          <w:rPr>
-            <w:rStyle w:val="Hyperlink"/>
-          </w:rPr>
-          <w:t>http://cldr.unicode.org/index/downloads</w:t>
-        </w:r>
-      </w:hyperlink>
-      <w:r>
-        <w:t xml:space="preserve">. Follow the Data link, download the </w:t>
-      </w:r>
-      <w:proofErr w:type="spellStart"/>
-      <w:r>
-        <w:t>cldr</w:t>
-      </w:r>
-      <w:proofErr w:type="spellEnd"/>
-      <w:r>
-        <w:t xml:space="preserve">-common zip file and look in common\collation for the desired </w:t>
-      </w:r>
-      <w:r>
-        <w:t>xml</w:t>
-      </w:r>
-      <w:r>
-        <w:t xml:space="preserve"> file. T</w:t>
-      </w:r>
-      <w:r>
-        <w:t xml:space="preserve">he master list of </w:t>
-      </w:r>
-      <w:r>
-        <w:t>rules</w:t>
-      </w:r>
-      <w:r>
-        <w:t xml:space="preserve"> for ICU code points is in the common\</w:t>
-      </w:r>
-      <w:proofErr w:type="spellStart"/>
-      <w:r>
-        <w:t>uca</w:t>
-      </w:r>
-      <w:proofErr w:type="spellEnd"/>
-      <w:r>
-        <w:t xml:space="preserve">\UCA_Rules.txt file in the </w:t>
-      </w:r>
-      <w:proofErr w:type="spellStart"/>
-      <w:r>
-        <w:t>cldr</w:t>
-      </w:r>
-      <w:proofErr w:type="spellEnd"/>
-      <w:r>
-        <w:t>-common zip file</w:t>
-      </w:r>
-      <w:r>
-        <w:t>.</w:t>
-      </w:r>
-      <w:r>
-        <w:t xml:space="preserve"> The collations element in the </w:t>
-      </w:r>
-      <w:proofErr w:type="spellStart"/>
-      <w:r>
-        <w:t>ldml</w:t>
-      </w:r>
-      <w:proofErr w:type="spellEnd"/>
-      <w:r>
-        <w:t xml:space="preserve"> file may contain multiple collation elements. FieldWorks </w:t>
-      </w:r>
-      <w:r>
-        <w:t xml:space="preserve">only </w:t>
-      </w:r>
-      <w:r>
-        <w:t xml:space="preserve">uses the standard collation element which can be found by searching for </w:t>
-      </w:r>
-      <w:r>
-        <w:t>&lt;collation type="standard"</w:t>
-      </w:r>
-      <w:r>
-        <w:t>.</w:t>
-      </w:r>
     </w:p>
     <w:p>
       <w:pPr>
         <w:pStyle w:val="BodyText"/>
       </w:pPr>
       <w:r>
-        <w:t>In FieldWorks Version 9,</w:t>
-      </w:r>
-      <w:r>
-        <w:t xml:space="preserve"> the first time </w:t>
-      </w:r>
-      <w:r>
-        <w:t>you add a new writing system</w:t>
-      </w:r>
-      <w:r>
-        <w:t xml:space="preserve"> (e.g., </w:t>
-      </w:r>
-      <w:r>
-        <w:t>Hindi</w:t>
-      </w:r>
-      <w:r>
-        <w:t>)</w:t>
-      </w:r>
-      <w:r>
-        <w:t>, on your machine, and you are connected to the Internet, it will download the hi.</w:t>
-      </w:r>
-      <w:r>
-        <w:t>xml</w:t>
-      </w:r>
-      <w:r>
-        <w:t xml:space="preserve"> file from </w:t>
-      </w:r>
-      <w:r>
-        <w:t xml:space="preserve">the SLDR and store it </w:t>
-      </w:r>
-      <w:r>
-        <w:t>in C</w:t>
-      </w:r>
-      <w:r>
-        <w:t>:\ProgramData\SIL\SldrCache</w:t>
-      </w:r>
-      <w:r>
-        <w:t xml:space="preserve"> as </w:t>
-      </w:r>
+        <w:t>Toolbox specifies diacritic ordering like this.</w:t>
+      </w:r>
+    </w:p>
+    <w:p>
+      <w:pPr>
+        <w:pStyle w:val="Example"/>
+      </w:pPr>
+      <w:r>
+        <w:rPr>
+          <w:rFonts w:hint="eastAsia"/>
+        </w:rPr>
+        <w:t>\</w:t>
+      </w:r>
+      <w:proofErr w:type="spellStart"/>
+      <w:r>
+        <w:rPr>
+          <w:rFonts w:hint="eastAsia"/>
+        </w:rPr>
+        <w:t>SecFollowing</w:t>
+      </w:r>
+      <w:proofErr w:type="spellEnd"/>
+      <w:r>
+        <w:rPr>
+          <w:rFonts w:hint="eastAsia"/>
+        </w:rPr>
+        <w:t xml:space="preserve"> </w:t>
+      </w:r>
+      <w:r>
+        <w:rPr>
+          <w:rFonts w:hint="eastAsia"/>
+        </w:rPr>
+        <w:t>ˋ</w:t>
+      </w:r>
+      <w:r>
+        <w:rPr>
+          <w:rFonts w:hint="eastAsia"/>
+        </w:rPr>
+        <w:t xml:space="preserve"> </w:t>
+      </w:r>
+      <w:r>
+        <w:rPr>
+          <w:rFonts w:hint="eastAsia"/>
+        </w:rPr>
+        <w:t>¯</w:t>
+      </w:r>
+      <w:r>
+        <w:rPr>
+          <w:rFonts w:hint="eastAsia"/>
+        </w:rPr>
+        <w:t xml:space="preserve"> </w:t>
+      </w:r>
+      <w:r>
+        <w:rPr>
+          <w:rFonts w:hint="eastAsia"/>
+        </w:rPr>
+        <w:t>ˆ</w:t>
+      </w:r>
+      <w:r>
+        <w:rPr>
+          <w:rFonts w:hint="eastAsia"/>
+        </w:rPr>
+        <w:t xml:space="preserve"> </w:t>
+      </w:r>
+      <w:r>
+        <w:rPr>
+          <w:rFonts w:hint="eastAsia"/>
+        </w:rPr>
+        <w:t>ˊ</w:t>
+      </w:r>
+      <w:r>
+        <w:rPr>
+          <w:rFonts w:hint="eastAsia"/>
+        </w:rPr>
+        <w:t xml:space="preserve"> </w:t>
+      </w:r>
+      <w:r>
+        <w:rPr>
+          <w:rFonts w:hint="eastAsia"/>
+        </w:rPr>
+        <w:t>˜</w:t>
+      </w:r>
+      <w:r>
+        <w:rPr>
+          <w:rFonts w:hint="eastAsia"/>
+        </w:rPr>
+        <w:t xml:space="preserve"> </w:t>
+      </w:r>
+      <w:r>
+        <w:rPr>
+          <w:rFonts w:hint="eastAsia"/>
+        </w:rPr>
+        <w:t>ˇ</w:t>
+      </w:r>
+    </w:p>
+    <w:p>
+      <w:pPr>
+        <w:pStyle w:val="BodyText"/>
+      </w:pPr>
+      <w:r>
+        <w:t>ICU defaults to secondary ordering of all diacritics using a fixed order. However, these characters are not true diacritics, but modifier letter diacritics that do not combine with a vowel. Toolbox specifies these as secondary ordering, so we can replace this with the equivalent ICU rule for secondary ordering.</w:t>
+      </w:r>
+    </w:p>
+    <w:p>
+      <w:pPr>
+        <w:pStyle w:val="Example"/>
+      </w:pPr>
+      <w:r>
+        <w:rPr>
+          <w:rFonts w:hint="eastAsia"/>
+        </w:rPr>
+        <w:t xml:space="preserve">&amp; [first secondary ignorable] &lt;&lt; </w:t>
+      </w:r>
+      <w:r>
+        <w:rPr>
+          <w:rFonts w:hint="eastAsia"/>
+        </w:rPr>
+        <w:t>ˋ</w:t>
+      </w:r>
+      <w:r>
+        <w:rPr>
+          <w:rFonts w:hint="eastAsia"/>
+        </w:rPr>
+        <w:t xml:space="preserve"> &lt;&lt; </w:t>
+      </w:r>
+      <w:r>
+        <w:rPr>
+          <w:rFonts w:hint="eastAsia"/>
+        </w:rPr>
+        <w:t>¯</w:t>
+      </w:r>
+      <w:r>
+        <w:rPr>
+          <w:rFonts w:hint="eastAsia"/>
+        </w:rPr>
+        <w:t xml:space="preserve"> &lt;&lt; </w:t>
+      </w:r>
+      <w:r>
+        <w:rPr>
+          <w:rFonts w:hint="eastAsia"/>
+        </w:rPr>
+        <w:t>ˆ</w:t>
+      </w:r>
+      <w:r>
+        <w:rPr>
+          <w:rFonts w:hint="eastAsia"/>
+        </w:rPr>
+        <w:t xml:space="preserve"> &lt;&lt; </w:t>
+      </w:r>
+      <w:r>
+        <w:rPr>
+          <w:rFonts w:hint="eastAsia"/>
+        </w:rPr>
+        <w:t>ˊ</w:t>
+      </w:r>
+      <w:r>
+        <w:rPr>
+          <w:rFonts w:hint="eastAsia"/>
+        </w:rPr>
+        <w:t xml:space="preserve"> &lt;&lt; </w:t>
+      </w:r>
+      <w:r>
+        <w:rPr>
+          <w:rFonts w:hint="eastAsia"/>
+        </w:rPr>
+        <w:t>˜</w:t>
+      </w:r>
+      <w:r>
+        <w:rPr>
+          <w:rFonts w:hint="eastAsia"/>
+        </w:rPr>
+        <w:t xml:space="preserve"> &lt;&lt; </w:t>
+      </w:r>
+      <w:r>
+        <w:rPr>
+          <w:rFonts w:hint="eastAsia"/>
+        </w:rPr>
+        <w:t>ˇ</w:t>
+      </w:r>
+    </w:p>
+    <w:p>
+      <w:pPr>
+        <w:pStyle w:val="BodyText"/>
+      </w:pPr>
+      <w:r>
+        <w:t>Toolbox specifies characters to be ignored in this way.</w:t>
+      </w:r>
+    </w:p>
+    <w:p>
+      <w:pPr>
+        <w:pStyle w:val="Example"/>
+      </w:pPr>
+      <w:r>
+        <w:t>\ignore _ - =</w:t>
+      </w:r>
+    </w:p>
+    <w:p>
+      <w:pPr>
+        <w:pStyle w:val="BodyText"/>
+      </w:pPr>
+      <w:r>
+        <w:t>This can be turned into an ICU rule that ignores these characters.</w:t>
+      </w:r>
+    </w:p>
+    <w:p>
+      <w:pPr>
+        <w:pStyle w:val="Example"/>
+      </w:pPr>
+      <w:r>
+        <w:t>&amp; [last tertiary ignorable] = '_' = '-' = '='</w:t>
+      </w:r>
+    </w:p>
+    <w:p>
+      <w:pPr>
+        <w:pStyle w:val="BodyText"/>
+      </w:pPr>
+      <w:r>
+        <w:t>ICU defaults to sorting digits before alphabetical characters. If you want to place digits at the end of the alphabet</w:t>
+      </w:r>
+      <w:r>
+        <w:t xml:space="preserve"> as in this case</w:t>
+      </w:r>
+      <w:r>
+        <w:t>, you can use this ICU rule:</w:t>
+      </w:r>
+    </w:p>
+    <w:p>
+      <w:pPr>
+        <w:pStyle w:val="Example"/>
+      </w:pPr>
       <w:proofErr w:type="gramStart"/>
       <w:r>
-        <w:t>an</w:t>
+        <w:t>&amp;[</w:t>
       </w:r>
       <w:proofErr w:type="gramEnd"/>
       <w:r>
-        <w:t xml:space="preserve"> </w:t>
-      </w:r>
-      <w:proofErr w:type="spellStart"/>
-      <w:r>
-        <w:t>ldml</w:t>
-      </w:r>
-      <w:proofErr w:type="spellEnd"/>
-      <w:r>
-        <w:t xml:space="preserve"> file</w:t>
-      </w:r>
-      <w:r>
-        <w:t xml:space="preserve">. </w:t>
-      </w:r>
-      <w:r>
-        <w:t>It then stores this information in</w:t>
-      </w:r>
-      <w:r>
-        <w:t xml:space="preserve"> the project’s </w:t>
-      </w:r>
-      <w:proofErr w:type="spellStart"/>
-      <w:r>
-        <w:t>WritingSystemStore</w:t>
-      </w:r>
-      <w:proofErr w:type="spellEnd"/>
-      <w:r>
-        <w:t xml:space="preserve"> directory, and will</w:t>
-      </w:r>
-      <w:r>
-        <w:t xml:space="preserve"> also</w:t>
-      </w:r>
-      <w:r>
-        <w:t xml:space="preserve"> save a copy in the global </w:t>
-      </w:r>
-      <w:r>
-        <w:t>repository</w:t>
-      </w:r>
-      <w:r>
-        <w:t xml:space="preserve"> for use when other projects</w:t>
-      </w:r>
-      <w:r>
-        <w:t xml:space="preserve"> or programs</w:t>
-      </w:r>
-      <w:r>
-        <w:t xml:space="preserve"> need the information.</w:t>
-      </w:r>
-      <w:r>
-        <w:t xml:space="preserve"> The writing system property dialog displays the collation from the </w:t>
-      </w:r>
-      <w:proofErr w:type="spellStart"/>
-      <w:r>
-        <w:t>ldml</w:t>
-      </w:r>
-      <w:proofErr w:type="spellEnd"/>
-      <w:r>
-        <w:t xml:space="preserve"> file in the Sort tab. </w:t>
-      </w:r>
-      <w:r>
-        <w:t>When you make changes in this tab,</w:t>
-      </w:r>
-      <w:r>
-        <w:t xml:space="preserve"> it</w:t>
-      </w:r>
-      <w:r>
-        <w:t xml:space="preserve"> copies your changes </w:t>
-      </w:r>
-      <w:r>
-        <w:t xml:space="preserve">into the current project </w:t>
-      </w:r>
-      <w:proofErr w:type="spellStart"/>
-      <w:r>
-        <w:t>hi.ldml</w:t>
-      </w:r>
-      <w:proofErr w:type="spellEnd"/>
-      <w:r>
-        <w:t xml:space="preserve"> and also update</w:t>
-      </w:r>
-      <w:r>
-        <w:t>s</w:t>
-      </w:r>
-      <w:r>
-        <w:t xml:space="preserve"> the copy in the global </w:t>
-      </w:r>
-      <w:r>
-        <w:t>repository</w:t>
-      </w:r>
-      <w:r>
-        <w:t xml:space="preserve">, but will not affect the original in </w:t>
-      </w:r>
-      <w:proofErr w:type="spellStart"/>
-      <w:r>
-        <w:t>SldrCache</w:t>
-      </w:r>
-      <w:proofErr w:type="spellEnd"/>
-      <w:r>
-        <w:t>.</w:t>
+        <w:t>last regular]</w:t>
+      </w:r>
+      <w:r>
+        <w:t>&lt; 0 &lt; 1 &lt; 2 &lt; 3 &lt; 4 &lt; 5 &lt; 6 &lt; 7 &lt; 8 &lt; 9</w:t>
       </w:r>
     </w:p>
     <w:p>
@@ -7013,57 +8404,228 @@
         <w:pStyle w:val="BodyText"/>
       </w:pPr>
       <w:r>
-        <w:t xml:space="preserve">In </w:t>
-      </w:r>
-      <w:r>
-        <w:t>FLEx</w:t>
-      </w:r>
-      <w:r>
-        <w:t>, you can choose an option in the Sort tab to use a collation from a standard language, which uses the default definitions built into ICU. If you need to make any adjus</w:t>
-      </w:r>
-      <w:r>
-        <w:t>t</w:t>
-      </w:r>
-      <w:r>
-        <w:t xml:space="preserve">ment to the standard collation, you need to get the ICU rules for </w:t>
-      </w:r>
-      <w:r>
-        <w:t>the</w:t>
-      </w:r>
-      <w:r>
-        <w:t xml:space="preserve"> language and paste them into the Custom ICU rules pane in the Sort tab. Then you can customize these rules in any way you want for your purposes. If </w:t>
-      </w:r>
-      <w:r>
-        <w:t>FLEx</w:t>
-      </w:r>
-      <w:r>
-        <w:t xml:space="preserve"> downloaded the file via the SLDR, the rules for that language will already be in the Custom ICU rules. If you have an existing </w:t>
-      </w:r>
-      <w:proofErr w:type="spellStart"/>
-      <w:r>
-        <w:t>ldml</w:t>
-      </w:r>
-      <w:proofErr w:type="spellEnd"/>
-      <w:r>
-        <w:t xml:space="preserve"> file that does not have the correct rules, you can use one of the resources above to get the current file and copy the rules to your Custom ICU rules dialog.</w:t>
-      </w:r>
-    </w:p>
-    <w:p>
-      <w:pPr>
-        <w:pStyle w:val="Heading1"/>
-      </w:pPr>
-      <w:bookmarkStart w:id="24" w:name="_Toc201668578"/>
-      <w:r>
-        <w:t>Converting Toolbox sort rules to ICU rules</w:t>
-      </w:r>
-      <w:bookmarkEnd w:id="24"/>
+        <w:t xml:space="preserve">Putting all of this together, here is the complete </w:t>
+      </w:r>
+      <w:r>
+        <w:t xml:space="preserve">ICU </w:t>
+      </w:r>
+      <w:r>
+        <w:t>collation.</w:t>
+      </w:r>
+    </w:p>
+    <w:p>
+      <w:pPr>
+        <w:pStyle w:val="Example"/>
+      </w:pPr>
+      <w:r>
+        <w:t>[</w:t>
+      </w:r>
+      <w:proofErr w:type="spellStart"/>
+      <w:r>
+        <w:t>caseFirst</w:t>
+      </w:r>
+      <w:proofErr w:type="spellEnd"/>
+      <w:r>
+        <w:t xml:space="preserve"> upper]</w:t>
+      </w:r>
+      <w:r>
+        <w:br/>
+      </w:r>
+      <w:r>
+        <w:t>&amp; a &lt;&lt; á &lt;&lt;&lt; Á &lt;&lt; a̱ &lt;&lt;&lt; A̱ &lt;&lt; á̱ &lt;&lt;&lt; Á̱</w:t>
+      </w:r>
+      <w:r>
+        <w:br/>
+      </w:r>
+      <w:r>
+        <w:t xml:space="preserve">&amp; c &lt; </w:t>
+      </w:r>
+      <w:proofErr w:type="spellStart"/>
+      <w:r>
+        <w:t>ch</w:t>
+      </w:r>
+      <w:proofErr w:type="spellEnd"/>
+      <w:r>
+        <w:t xml:space="preserve"> &lt;&lt;&lt; Ch</w:t>
+      </w:r>
+      <w:r>
+        <w:br/>
+      </w:r>
+      <w:r>
+        <w:t>&amp; e &lt;&lt; é &lt;&lt;&lt; É &lt;&lt; e̱ &lt;&lt;&lt; E̱ &lt;&lt; é̱ &lt;&lt;&lt; É̱</w:t>
+      </w:r>
+      <w:r>
+        <w:br/>
+      </w:r>
+      <w:r>
+        <w:t xml:space="preserve">&amp; g &lt;&lt; </w:t>
+      </w:r>
+      <w:proofErr w:type="spellStart"/>
+      <w:r>
+        <w:t>gu</w:t>
+      </w:r>
+      <w:proofErr w:type="spellEnd"/>
+      <w:r>
+        <w:t xml:space="preserve"> &lt;&lt; </w:t>
+      </w:r>
+      <w:proofErr w:type="spellStart"/>
+      <w:r>
+        <w:t>gü</w:t>
+      </w:r>
+      <w:proofErr w:type="spellEnd"/>
+      <w:r>
+        <w:t xml:space="preserve"> &lt; ꞌg &lt;&lt;&lt; ꞌG</w:t>
+      </w:r>
+      <w:r>
+        <w:br/>
+      </w:r>
+      <w:r>
+        <w:t xml:space="preserve">&amp; </w:t>
+      </w:r>
+      <w:proofErr w:type="spellStart"/>
+      <w:r>
+        <w:t>i</w:t>
+      </w:r>
+      <w:proofErr w:type="spellEnd"/>
+      <w:r>
+        <w:t xml:space="preserve"> &lt;&lt; í &lt;&lt;&lt; Í &lt;&lt; </w:t>
+      </w:r>
+      <w:proofErr w:type="spellStart"/>
+      <w:r>
+        <w:t>i</w:t>
+      </w:r>
+      <w:proofErr w:type="spellEnd"/>
+      <w:r>
+        <w:t>̱ &lt;&lt;&lt; I̱ &lt;&lt; í̱ &lt;&lt;&lt; Í̱ &lt; ɨ &lt;&lt;&lt; Ɨ &lt;&lt; ɨ́ &lt;&lt;&lt; Ɨ́ &lt;&lt; ɨ̱́ &lt;&lt;&lt; ̱́</w:t>
+      </w:r>
+      <w:r>
+        <w:br/>
+      </w:r>
+      <w:r>
+        <w:t>&amp; l &lt; ꞌl &lt;&lt;&lt; ꞌL</w:t>
+      </w:r>
+      <w:r>
+        <w:br/>
+      </w:r>
+      <w:r>
+        <w:t>&amp; m &lt; ꞌm &lt;&lt;&lt; ꞌM</w:t>
+      </w:r>
+      <w:r>
+        <w:br/>
+      </w:r>
+      <w:r>
+        <w:t>&amp; n &lt; ꞌñ &lt;&lt;&lt; ꞌÑ</w:t>
+      </w:r>
+      <w:r>
+        <w:br/>
+      </w:r>
+      <w:r>
+        <w:t>&amp; o &lt;&lt; ó &lt;&lt;&lt; Ó &lt;&lt; o̱ &lt;&lt;&lt; O̱ &lt;&lt; ó̱ &lt;&lt;&lt; Ó̱ &lt; ø &lt;&lt;&lt; Ø &lt;&lt; ǿ &lt;&lt;&lt; Ǿ &lt;&lt; ø̱ &lt;&lt;&lt; Ø̱ &lt;&lt; ǿ̱ &lt;&lt;&lt; Ǿ̱</w:t>
+      </w:r>
+      <w:r>
+        <w:br/>
+      </w:r>
+      <w:r>
+        <w:t>&amp; u &lt;&lt; ú &lt;&lt;&lt; Ú &lt;&lt; u̱ &lt;&lt;&lt; U̱ &lt;&lt; ú̱ &lt;&lt;&lt; Ú̱ &lt;&lt; ü &lt; ʉ &lt;&lt;&lt; Ʉ &lt;&lt; ʉ́ &lt;&lt;&lt; Ʉ́ &lt;&lt; ʉ̱ &lt;&lt;&lt; Ʉ̱ &lt;&lt; ʉ̱́ &lt;&lt;&lt; ̱́</w:t>
+      </w:r>
+      <w:r>
+        <w:br/>
+      </w:r>
+      <w:r>
+        <w:t>&amp;[last regular]</w:t>
+      </w:r>
+      <w:r>
+        <w:t xml:space="preserve"> &lt; ꞌ &lt; 0 &lt; 1 &lt; 2 &lt; 3 &lt; 4 &lt; 5 &lt; 6 &lt; 7 &lt; 8 &lt; 9</w:t>
+      </w:r>
+      <w:r>
+        <w:br/>
+      </w:r>
+      <w:r>
+        <w:rPr>
+          <w:rFonts w:hint="eastAsia"/>
+        </w:rPr>
+        <w:lastRenderedPageBreak/>
+        <w:t xml:space="preserve">&amp; [first secondary ignorable] &lt;&lt; </w:t>
+      </w:r>
+      <w:r>
+        <w:rPr>
+          <w:rFonts w:hint="eastAsia"/>
+        </w:rPr>
+        <w:t>ˋ</w:t>
+      </w:r>
+      <w:r>
+        <w:rPr>
+          <w:rFonts w:hint="eastAsia"/>
+        </w:rPr>
+        <w:t xml:space="preserve"> &lt;&lt; </w:t>
+      </w:r>
+      <w:r>
+        <w:rPr>
+          <w:rFonts w:hint="eastAsia"/>
+        </w:rPr>
+        <w:t>¯</w:t>
+      </w:r>
+      <w:r>
+        <w:rPr>
+          <w:rFonts w:hint="eastAsia"/>
+        </w:rPr>
+        <w:t xml:space="preserve"> &lt;&lt; </w:t>
+      </w:r>
+      <w:r>
+        <w:rPr>
+          <w:rFonts w:hint="eastAsia"/>
+        </w:rPr>
+        <w:t>ˆ</w:t>
+      </w:r>
+      <w:r>
+        <w:rPr>
+          <w:rFonts w:hint="eastAsia"/>
+        </w:rPr>
+        <w:t xml:space="preserve"> &lt;&lt; </w:t>
+      </w:r>
+      <w:r>
+        <w:rPr>
+          <w:rFonts w:hint="eastAsia"/>
+        </w:rPr>
+        <w:t>ˊ</w:t>
+      </w:r>
+      <w:r>
+        <w:rPr>
+          <w:rFonts w:hint="eastAsia"/>
+        </w:rPr>
+        <w:t xml:space="preserve"> &lt;&lt; </w:t>
+      </w:r>
+      <w:r>
+        <w:rPr>
+          <w:rFonts w:hint="eastAsia"/>
+        </w:rPr>
+        <w:t>˜</w:t>
+      </w:r>
+      <w:r>
+        <w:rPr>
+          <w:rFonts w:hint="eastAsia"/>
+        </w:rPr>
+        <w:t xml:space="preserve"> &lt;&lt; </w:t>
+      </w:r>
+      <w:r>
+        <w:rPr>
+          <w:rFonts w:hint="eastAsia"/>
+        </w:rPr>
+        <w:t>ˇ</w:t>
+      </w:r>
+      <w:r>
+        <w:br/>
+      </w:r>
+      <w:r>
+        <w:t>&amp; [last tertiary ignorable] = '_' = '-' = '='</w:t>
+      </w:r>
     </w:p>
     <w:p>
       <w:pPr>
         <w:pStyle w:val="BodyText"/>
       </w:pPr>
       <w:r>
-        <w:t>Toolbox stores collations in a .</w:t>
+        <w:t xml:space="preserve">In general, you can take a Toolbox </w:t>
       </w:r>
       <w:proofErr w:type="spellStart"/>
       <w:r>
@@ -7071,936 +8633,25 @@
       </w:r>
       <w:proofErr w:type="spellEnd"/>
       <w:r>
-        <w:t xml:space="preserve"> file in the main Toolbox directory. Here is a fairly complex sort specification, where </w:t>
-      </w:r>
-      <w:proofErr w:type="spellStart"/>
-      <w:r>
-        <w:t>cco</w:t>
-      </w:r>
-      <w:proofErr w:type="spellEnd"/>
-      <w:r>
-        <w:t xml:space="preserve"> is the code for the language:</w:t>
-      </w:r>
-    </w:p>
-    <w:p>
-      <w:pPr>
-        <w:pStyle w:val="Example"/>
-      </w:pPr>
-      <w:r>
-        <w:t>\+</w:t>
-      </w:r>
-      <w:proofErr w:type="spellStart"/>
-      <w:r>
-        <w:t>srt</w:t>
-      </w:r>
-      <w:proofErr w:type="spellEnd"/>
-      <w:r>
-        <w:t xml:space="preserve"> </w:t>
-      </w:r>
-      <w:proofErr w:type="spellStart"/>
-      <w:r>
-        <w:t>cco</w:t>
-      </w:r>
-      <w:proofErr w:type="spellEnd"/>
-      <w:r>
-        <w:t xml:space="preserve"> order</w:t>
-      </w:r>
-      <w:r>
-        <w:br/>
-      </w:r>
-      <w:r>
-        <w:t xml:space="preserve">\primary A </w:t>
-      </w:r>
-      <w:proofErr w:type="spellStart"/>
-      <w:r>
-        <w:t>a</w:t>
-      </w:r>
-      <w:proofErr w:type="spellEnd"/>
-      <w:r>
-        <w:t xml:space="preserve"> Á </w:t>
-      </w:r>
-      <w:proofErr w:type="spellStart"/>
-      <w:r>
-        <w:t>á</w:t>
-      </w:r>
-      <w:proofErr w:type="spellEnd"/>
-      <w:r>
-        <w:t xml:space="preserve"> A̱ a̱ Á̱ á̱</w:t>
-      </w:r>
-      <w:r>
-        <w:br/>
-      </w:r>
-      <w:r>
-        <w:t xml:space="preserve">B </w:t>
-      </w:r>
-      <w:proofErr w:type="spellStart"/>
-      <w:r>
-        <w:t>b</w:t>
-      </w:r>
-      <w:proofErr w:type="spellEnd"/>
-      <w:r>
-        <w:br/>
-      </w:r>
-      <w:r>
-        <w:t xml:space="preserve">C </w:t>
-      </w:r>
-      <w:proofErr w:type="spellStart"/>
-      <w:r>
-        <w:t>c</w:t>
-      </w:r>
-      <w:proofErr w:type="spellEnd"/>
-      <w:r>
-        <w:t xml:space="preserve"> </w:t>
-      </w:r>
-      <w:r>
-        <w:br/>
-      </w:r>
-      <w:r>
-        <w:t xml:space="preserve">Ch </w:t>
-      </w:r>
-      <w:proofErr w:type="spellStart"/>
-      <w:r>
-        <w:t>ch</w:t>
-      </w:r>
-      <w:proofErr w:type="spellEnd"/>
-      <w:r>
-        <w:br/>
-      </w:r>
-      <w:r>
-        <w:t xml:space="preserve">D </w:t>
-      </w:r>
-      <w:proofErr w:type="spellStart"/>
-      <w:r>
-        <w:t>d</w:t>
-      </w:r>
-      <w:proofErr w:type="spellEnd"/>
-      <w:r>
-        <w:br/>
-      </w:r>
-      <w:r>
-        <w:t xml:space="preserve">E </w:t>
-      </w:r>
-      <w:proofErr w:type="spellStart"/>
-      <w:r>
-        <w:t>e</w:t>
-      </w:r>
-      <w:proofErr w:type="spellEnd"/>
-      <w:r>
-        <w:t xml:space="preserve"> É </w:t>
-      </w:r>
-      <w:proofErr w:type="spellStart"/>
-      <w:r>
-        <w:t>é</w:t>
-      </w:r>
-      <w:proofErr w:type="spellEnd"/>
-      <w:r>
-        <w:t xml:space="preserve"> E̱ e̱ É̱ é̱</w:t>
-      </w:r>
-      <w:r>
-        <w:br/>
-      </w:r>
-      <w:r>
-        <w:t xml:space="preserve">F </w:t>
-      </w:r>
-      <w:proofErr w:type="spellStart"/>
-      <w:r>
-        <w:t>f</w:t>
-      </w:r>
-      <w:proofErr w:type="spellEnd"/>
-      <w:r>
-        <w:br/>
-      </w:r>
-      <w:r>
-        <w:t xml:space="preserve">G </w:t>
-      </w:r>
-      <w:proofErr w:type="spellStart"/>
-      <w:r>
-        <w:t>g</w:t>
-      </w:r>
-      <w:proofErr w:type="spellEnd"/>
-      <w:r>
-        <w:t xml:space="preserve"> </w:t>
-      </w:r>
-      <w:proofErr w:type="spellStart"/>
-      <w:r>
-        <w:t>gu</w:t>
-      </w:r>
-      <w:proofErr w:type="spellEnd"/>
-      <w:r>
-        <w:t xml:space="preserve"> </w:t>
-      </w:r>
-      <w:proofErr w:type="spellStart"/>
-      <w:r>
-        <w:t>gü</w:t>
-      </w:r>
-      <w:proofErr w:type="spellEnd"/>
-      <w:r>
-        <w:br/>
-      </w:r>
-      <w:r>
-        <w:t>ꞌG ꞌg</w:t>
-      </w:r>
-      <w:r>
-        <w:br/>
-      </w:r>
-      <w:r>
-        <w:lastRenderedPageBreak/>
-        <w:t xml:space="preserve">H </w:t>
-      </w:r>
-      <w:proofErr w:type="spellStart"/>
-      <w:r>
-        <w:t>h</w:t>
-      </w:r>
-      <w:proofErr w:type="spellEnd"/>
-      <w:r>
-        <w:br/>
-      </w:r>
-      <w:r>
-        <w:t xml:space="preserve">I </w:t>
-      </w:r>
-      <w:proofErr w:type="spellStart"/>
-      <w:r>
-        <w:t>i</w:t>
-      </w:r>
-      <w:proofErr w:type="spellEnd"/>
-      <w:r>
-        <w:t xml:space="preserve"> Í </w:t>
-      </w:r>
-      <w:proofErr w:type="spellStart"/>
-      <w:r>
-        <w:t>í</w:t>
-      </w:r>
-      <w:proofErr w:type="spellEnd"/>
-      <w:r>
-        <w:t xml:space="preserve"> I̱ </w:t>
-      </w:r>
-      <w:proofErr w:type="spellStart"/>
-      <w:r>
-        <w:t>i</w:t>
-      </w:r>
-      <w:proofErr w:type="spellEnd"/>
-      <w:r>
-        <w:t>̱ Í̱ í̱</w:t>
-      </w:r>
-      <w:r>
-        <w:br/>
-      </w:r>
-      <w:r>
-        <w:t xml:space="preserve">Ɨ </w:t>
-      </w:r>
-      <w:proofErr w:type="spellStart"/>
-      <w:r>
-        <w:t>ɨ</w:t>
-      </w:r>
-      <w:proofErr w:type="spellEnd"/>
-      <w:r>
-        <w:t xml:space="preserve"> </w:t>
-      </w:r>
-      <w:proofErr w:type="spellStart"/>
-      <w:r>
-        <w:t>Ɨ</w:t>
-      </w:r>
-      <w:proofErr w:type="spellEnd"/>
-      <w:r>
-        <w:t>́ ɨ́ Ɨ̱ ɨ̱ Ɨ̱́ ɨ̱́</w:t>
-      </w:r>
-      <w:r>
-        <w:br/>
-      </w:r>
-      <w:r>
-        <w:t xml:space="preserve">J </w:t>
-      </w:r>
-      <w:proofErr w:type="spellStart"/>
-      <w:r>
-        <w:t>j</w:t>
-      </w:r>
-      <w:proofErr w:type="spellEnd"/>
-      <w:r>
-        <w:br/>
-      </w:r>
-      <w:r>
-        <w:t xml:space="preserve">K </w:t>
-      </w:r>
-      <w:proofErr w:type="spellStart"/>
-      <w:r>
-        <w:t>k</w:t>
-      </w:r>
-      <w:proofErr w:type="spellEnd"/>
-      <w:r>
-        <w:br/>
-      </w:r>
-      <w:r>
-        <w:t xml:space="preserve">L </w:t>
-      </w:r>
-      <w:proofErr w:type="spellStart"/>
-      <w:r>
-        <w:t>l</w:t>
-      </w:r>
-      <w:proofErr w:type="spellEnd"/>
-      <w:r>
-        <w:br/>
-      </w:r>
-      <w:r>
-        <w:t>ꞌL ꞌl</w:t>
-      </w:r>
-      <w:r>
-        <w:br/>
-      </w:r>
-      <w:r>
-        <w:t xml:space="preserve">M </w:t>
-      </w:r>
-      <w:proofErr w:type="spellStart"/>
-      <w:r>
-        <w:t>m</w:t>
-      </w:r>
-      <w:proofErr w:type="spellEnd"/>
-      <w:r>
-        <w:br/>
-      </w:r>
-      <w:r>
-        <w:t>ꞌM ꞌm</w:t>
-      </w:r>
-      <w:r>
-        <w:br/>
-      </w:r>
-      <w:r>
-        <w:t xml:space="preserve">N </w:t>
-      </w:r>
-      <w:proofErr w:type="spellStart"/>
-      <w:r>
-        <w:t>n</w:t>
-      </w:r>
-      <w:proofErr w:type="spellEnd"/>
-      <w:r>
-        <w:br/>
-      </w:r>
-      <w:r>
-        <w:t>ꞌN ꞌn</w:t>
-      </w:r>
-      <w:r>
-        <w:br/>
-      </w:r>
-      <w:r>
-        <w:t xml:space="preserve">Ñ </w:t>
-      </w:r>
-      <w:proofErr w:type="spellStart"/>
-      <w:r>
-        <w:t>ñ</w:t>
-      </w:r>
-      <w:proofErr w:type="spellEnd"/>
-      <w:r>
-        <w:br/>
-      </w:r>
-      <w:r>
-        <w:t>ꞌÑ ꞌñ</w:t>
-      </w:r>
-      <w:r>
-        <w:br/>
-      </w:r>
-      <w:r>
-        <w:t xml:space="preserve">O </w:t>
-      </w:r>
-      <w:proofErr w:type="spellStart"/>
-      <w:r>
-        <w:t>o</w:t>
-      </w:r>
-      <w:proofErr w:type="spellEnd"/>
-      <w:r>
-        <w:t xml:space="preserve"> Ó </w:t>
-      </w:r>
-      <w:proofErr w:type="spellStart"/>
-      <w:r>
-        <w:t>ó</w:t>
-      </w:r>
-      <w:proofErr w:type="spellEnd"/>
-      <w:r>
-        <w:t xml:space="preserve"> O̱ o̱ Ó̱ ó̱</w:t>
-      </w:r>
-      <w:r>
-        <w:br/>
-      </w:r>
-      <w:r>
-        <w:t xml:space="preserve">Ø </w:t>
-      </w:r>
-      <w:proofErr w:type="spellStart"/>
-      <w:r>
-        <w:t>ø</w:t>
-      </w:r>
-      <w:proofErr w:type="spellEnd"/>
-      <w:r>
-        <w:t xml:space="preserve"> Ǿ </w:t>
-      </w:r>
-      <w:proofErr w:type="spellStart"/>
-      <w:r>
-        <w:t>ǿ</w:t>
-      </w:r>
-      <w:proofErr w:type="spellEnd"/>
-      <w:r>
-        <w:t xml:space="preserve"> Ø̱ ø̱ Ǿ̱ ǿ̱ </w:t>
-      </w:r>
-      <w:r>
-        <w:br/>
-      </w:r>
-      <w:r>
-        <w:t xml:space="preserve">P </w:t>
-      </w:r>
-      <w:proofErr w:type="spellStart"/>
-      <w:r>
-        <w:t>p</w:t>
-      </w:r>
-      <w:proofErr w:type="spellEnd"/>
-      <w:r>
-        <w:br/>
-      </w:r>
-      <w:r>
-        <w:t xml:space="preserve">Q </w:t>
-      </w:r>
-      <w:proofErr w:type="spellStart"/>
-      <w:r>
-        <w:t>q</w:t>
-      </w:r>
-      <w:proofErr w:type="spellEnd"/>
-      <w:r>
-        <w:br/>
-      </w:r>
-      <w:r>
-        <w:t xml:space="preserve">R </w:t>
-      </w:r>
-      <w:proofErr w:type="spellStart"/>
-      <w:r>
-        <w:t>r</w:t>
-      </w:r>
-      <w:proofErr w:type="spellEnd"/>
-      <w:r>
-        <w:br/>
-      </w:r>
-      <w:r>
-        <w:t xml:space="preserve">S </w:t>
-      </w:r>
-      <w:proofErr w:type="spellStart"/>
-      <w:r>
-        <w:t>s</w:t>
-      </w:r>
-      <w:proofErr w:type="spellEnd"/>
-      <w:r>
-        <w:br/>
-      </w:r>
-      <w:r>
-        <w:t xml:space="preserve">T </w:t>
-      </w:r>
-      <w:proofErr w:type="spellStart"/>
-      <w:r>
-        <w:t>t</w:t>
-      </w:r>
-      <w:proofErr w:type="spellEnd"/>
-      <w:r>
-        <w:br/>
-      </w:r>
-      <w:r>
-        <w:t xml:space="preserve">U </w:t>
-      </w:r>
-      <w:proofErr w:type="spellStart"/>
-      <w:r>
-        <w:t>u</w:t>
-      </w:r>
-      <w:proofErr w:type="spellEnd"/>
-      <w:r>
-        <w:t xml:space="preserve"> Ú </w:t>
-      </w:r>
-      <w:proofErr w:type="spellStart"/>
-      <w:r>
-        <w:t>ú</w:t>
-      </w:r>
-      <w:proofErr w:type="spellEnd"/>
-      <w:r>
-        <w:t xml:space="preserve"> U̱ u̱ Ú̱ ú̱ ü</w:t>
-      </w:r>
-      <w:r>
-        <w:br/>
-      </w:r>
-      <w:r>
-        <w:t>Ʉ ʉ Ʉ́ ʉ́ Ʉ̱ ʉ̱ Ʉ̱́ ʉ̱́</w:t>
-      </w:r>
-      <w:r>
-        <w:br/>
-      </w:r>
-      <w:r>
-        <w:t xml:space="preserve">V </w:t>
-      </w:r>
-      <w:proofErr w:type="spellStart"/>
-      <w:r>
-        <w:t>v</w:t>
-      </w:r>
-      <w:proofErr w:type="spellEnd"/>
-      <w:r>
-        <w:br/>
-      </w:r>
-      <w:r>
-        <w:t xml:space="preserve">W </w:t>
-      </w:r>
-      <w:proofErr w:type="spellStart"/>
-      <w:r>
-        <w:t>w</w:t>
-      </w:r>
-      <w:proofErr w:type="spellEnd"/>
-      <w:r>
-        <w:br/>
-      </w:r>
-      <w:r>
-        <w:t xml:space="preserve">X </w:t>
-      </w:r>
-      <w:proofErr w:type="spellStart"/>
-      <w:r>
-        <w:t>x</w:t>
-      </w:r>
-      <w:proofErr w:type="spellEnd"/>
-      <w:r>
-        <w:br/>
-      </w:r>
-      <w:r>
-        <w:t xml:space="preserve">Y </w:t>
-      </w:r>
-      <w:proofErr w:type="spellStart"/>
-      <w:r>
-        <w:t>y</w:t>
-      </w:r>
-      <w:proofErr w:type="spellEnd"/>
-      <w:r>
-        <w:br/>
-      </w:r>
-      <w:r>
-        <w:t xml:space="preserve">Z </w:t>
-      </w:r>
-      <w:proofErr w:type="spellStart"/>
-      <w:r>
-        <w:t>z</w:t>
-      </w:r>
-      <w:proofErr w:type="spellEnd"/>
-      <w:r>
-        <w:br/>
-      </w:r>
-      <w:r>
-        <w:t>ꞌ</w:t>
-      </w:r>
-      <w:r>
-        <w:br/>
-      </w:r>
-      <w:r>
-        <w:t>0</w:t>
-      </w:r>
-      <w:r>
-        <w:br/>
-      </w:r>
-      <w:r>
-        <w:t>1</w:t>
-      </w:r>
-      <w:r>
-        <w:br/>
-      </w:r>
-      <w:r>
-        <w:t>2</w:t>
-      </w:r>
-      <w:r>
-        <w:br/>
-      </w:r>
-      <w:r>
-        <w:t>3</w:t>
-      </w:r>
-      <w:r>
-        <w:br/>
-      </w:r>
-      <w:r>
-        <w:t>4</w:t>
-      </w:r>
-      <w:r>
-        <w:br/>
-      </w:r>
-      <w:r>
-        <w:t>5</w:t>
-      </w:r>
-      <w:r>
-        <w:br/>
-      </w:r>
-      <w:r>
-        <w:t>6</w:t>
-      </w:r>
-      <w:r>
-        <w:br/>
-      </w:r>
-      <w:r>
-        <w:t>7</w:t>
-      </w:r>
-      <w:r>
-        <w:br/>
-      </w:r>
-      <w:r>
-        <w:t>8</w:t>
-      </w:r>
-      <w:r>
-        <w:br/>
-      </w:r>
-      <w:r>
-        <w:t>9</w:t>
-      </w:r>
-      <w:r>
-        <w:br/>
-      </w:r>
-      <w:r>
-        <w:rPr>
-          <w:rFonts w:hint="eastAsia"/>
-        </w:rPr>
-        <w:t>\</w:t>
-      </w:r>
-      <w:proofErr w:type="spellStart"/>
-      <w:r>
-        <w:rPr>
-          <w:rFonts w:hint="eastAsia"/>
-        </w:rPr>
-        <w:t>SecFollowing</w:t>
-      </w:r>
-      <w:proofErr w:type="spellEnd"/>
-      <w:r>
-        <w:rPr>
-          <w:rFonts w:hint="eastAsia"/>
-        </w:rPr>
-        <w:t xml:space="preserve"> </w:t>
-      </w:r>
-      <w:r>
-        <w:rPr>
-          <w:rFonts w:hint="eastAsia"/>
-        </w:rPr>
-        <w:t>ˋ</w:t>
-      </w:r>
-      <w:r>
-        <w:rPr>
-          <w:rFonts w:hint="eastAsia"/>
-        </w:rPr>
-        <w:t xml:space="preserve"> </w:t>
-      </w:r>
-      <w:r>
-        <w:rPr>
-          <w:rFonts w:hint="eastAsia"/>
-        </w:rPr>
-        <w:t>¯</w:t>
-      </w:r>
-      <w:r>
-        <w:rPr>
-          <w:rFonts w:hint="eastAsia"/>
-        </w:rPr>
-        <w:t xml:space="preserve"> </w:t>
-      </w:r>
-      <w:r>
-        <w:rPr>
-          <w:rFonts w:hint="eastAsia"/>
-        </w:rPr>
-        <w:t>ˆ</w:t>
-      </w:r>
-      <w:r>
-        <w:rPr>
-          <w:rFonts w:hint="eastAsia"/>
-        </w:rPr>
-        <w:t xml:space="preserve"> </w:t>
-      </w:r>
-      <w:r>
-        <w:rPr>
-          <w:rFonts w:hint="eastAsia"/>
-        </w:rPr>
-        <w:t>ˊ</w:t>
-      </w:r>
-      <w:r>
-        <w:rPr>
-          <w:rFonts w:hint="eastAsia"/>
-        </w:rPr>
-        <w:t xml:space="preserve"> </w:t>
-      </w:r>
-      <w:r>
-        <w:rPr>
-          <w:rFonts w:hint="eastAsia"/>
-        </w:rPr>
-        <w:t>˜</w:t>
-      </w:r>
-      <w:r>
-        <w:rPr>
-          <w:rFonts w:hint="eastAsia"/>
-        </w:rPr>
-        <w:t xml:space="preserve"> </w:t>
-      </w:r>
-      <w:r>
-        <w:rPr>
-          <w:rFonts w:hint="eastAsia"/>
-        </w:rPr>
-        <w:t>ˇ</w:t>
-      </w:r>
-      <w:r>
-        <w:br/>
-      </w:r>
-      <w:r>
-        <w:t>\ignore _ - =</w:t>
-      </w:r>
-      <w:r>
-        <w:br/>
-      </w:r>
-      <w:r>
-        <w:t>\</w:t>
-      </w:r>
-      <w:proofErr w:type="spellStart"/>
-      <w:r>
-        <w:t>SecAfterBase</w:t>
-      </w:r>
-      <w:proofErr w:type="spellEnd"/>
-      <w:r>
-        <w:br/>
-      </w:r>
-      <w:r>
-        <w:t>\-</w:t>
-      </w:r>
-      <w:proofErr w:type="spellStart"/>
-      <w:r>
-        <w:t>srt</w:t>
-      </w:r>
-      <w:proofErr w:type="spellEnd"/>
-      <w:r>
-        <w:br/>
-      </w:r>
-      <w:r>
-        <w:br/>
-      </w:r>
-      <w:r>
-        <w:t>\</w:t>
-      </w:r>
-      <w:proofErr w:type="spellStart"/>
-      <w:r>
-        <w:t>SecPreceding</w:t>
-      </w:r>
-      <w:proofErr w:type="spellEnd"/>
-      <w:r>
-        <w:br/>
-      </w:r>
-      <w:r>
-        <w:t>\</w:t>
-      </w:r>
-      <w:proofErr w:type="spellStart"/>
-      <w:r>
-        <w:t>SecAfterBase</w:t>
-      </w:r>
-      <w:proofErr w:type="spellEnd"/>
-    </w:p>
-    <w:p>
-      <w:pPr>
-        <w:pStyle w:val="BodyText"/>
-      </w:pPr>
-      <w:r>
-        <w:lastRenderedPageBreak/>
-        <w:t>The \primary section lists characters with primary distinctions starting on a new line and secondary distinctions on the same line separated by spaces. Every character and digraph needs to be included.</w:t>
-      </w:r>
-    </w:p>
-    <w:p>
-      <w:pPr>
-        <w:pStyle w:val="BodyText"/>
-      </w:pPr>
-      <w:r>
-        <w:t>FLEx</w:t>
-      </w:r>
-      <w:r>
-        <w:t xml:space="preserve"> use</w:t>
-      </w:r>
-      <w:r>
-        <w:t xml:space="preserve">s ICU for specifying collation, and </w:t>
-      </w:r>
-      <w:r>
-        <w:t xml:space="preserve">ICU defines a default Unicode order for every character. Often this order is correct. You </w:t>
-      </w:r>
-      <w:r>
-        <w:t>could</w:t>
-      </w:r>
-      <w:r>
-        <w:t xml:space="preserve"> specify rules for every character if you want, but it's simpler to only list rules for characters that do not sort properly by default. Suppose Toolbox has this order:</w:t>
-      </w:r>
-    </w:p>
-    <w:p>
-      <w:pPr>
-        <w:pStyle w:val="Example"/>
-      </w:pPr>
-      <w:r>
-        <w:t xml:space="preserve">\primary A </w:t>
-      </w:r>
-      <w:proofErr w:type="spellStart"/>
-      <w:r>
-        <w:t>a</w:t>
-      </w:r>
-      <w:proofErr w:type="spellEnd"/>
-      <w:r>
-        <w:t xml:space="preserve"> Á </w:t>
-      </w:r>
-      <w:proofErr w:type="spellStart"/>
-      <w:r>
-        <w:t>á</w:t>
-      </w:r>
-      <w:proofErr w:type="spellEnd"/>
-      <w:r>
-        <w:br/>
-      </w:r>
-      <w:r>
-        <w:t xml:space="preserve">B </w:t>
-      </w:r>
-      <w:proofErr w:type="spellStart"/>
-      <w:r>
-        <w:t>b</w:t>
-      </w:r>
-      <w:proofErr w:type="spellEnd"/>
-      <w:r>
-        <w:br/>
-      </w:r>
-      <w:r>
-        <w:t xml:space="preserve">C </w:t>
-      </w:r>
-      <w:proofErr w:type="spellStart"/>
-      <w:r>
-        <w:t>c</w:t>
-      </w:r>
-      <w:proofErr w:type="spellEnd"/>
-      <w:r>
-        <w:t xml:space="preserve"> </w:t>
-      </w:r>
-      <w:r>
-        <w:br/>
-      </w:r>
-      <w:r>
-        <w:t xml:space="preserve">Ch </w:t>
-      </w:r>
-      <w:proofErr w:type="spellStart"/>
-      <w:r>
-        <w:t>ch</w:t>
-      </w:r>
-      <w:proofErr w:type="spellEnd"/>
-    </w:p>
-    <w:p>
-      <w:pPr>
-        <w:pStyle w:val="BodyText"/>
-      </w:pPr>
-      <w:r>
-        <w:t>a, b, c is already the default order, so we don't need to specify rules for that. We don't need to list composed character/diacritic letters in F</w:t>
-      </w:r>
-      <w:r>
-        <w:t>LE</w:t>
-      </w:r>
-      <w:r>
-        <w:t xml:space="preserve">x because internally it uses decomposed form </w:t>
-      </w:r>
-      <w:r>
-        <w:t xml:space="preserve">(NFD) </w:t>
-      </w:r>
-      <w:r>
-        <w:t xml:space="preserve">where the diacritic is a separate </w:t>
-      </w:r>
-      <w:r>
-        <w:t>code point</w:t>
-      </w:r>
-      <w:r>
-        <w:t xml:space="preserve"> after the vowel. Since diacritics sort after vowels using secondary ordering by default, we don't need to include them in collation rules unless you need an order different from the ICU default. </w:t>
-      </w:r>
-      <w:proofErr w:type="gramStart"/>
-      <w:r>
-        <w:t>So</w:t>
-      </w:r>
-      <w:proofErr w:type="gramEnd"/>
-      <w:r>
-        <w:t xml:space="preserve"> the only exception to defaults in this case is the </w:t>
-      </w:r>
-      <w:proofErr w:type="spellStart"/>
-      <w:r>
-        <w:t>ch</w:t>
-      </w:r>
-      <w:proofErr w:type="spellEnd"/>
-      <w:r>
-        <w:t xml:space="preserve"> digraph. </w:t>
-      </w:r>
-      <w:proofErr w:type="gramStart"/>
-      <w:r>
-        <w:t>So</w:t>
-      </w:r>
-      <w:proofErr w:type="gramEnd"/>
-      <w:r>
-        <w:t xml:space="preserve"> all we need is a rule to specify that the </w:t>
-      </w:r>
-      <w:r>
-        <w:t>“</w:t>
-      </w:r>
-      <w:proofErr w:type="spellStart"/>
-      <w:r>
-        <w:t>ch</w:t>
-      </w:r>
-      <w:proofErr w:type="spellEnd"/>
+        <w:t xml:space="preserve"> file and convert it to ICU rules quite easily. Anything that sorts by default in ICU can be dropped. Characters that start a new line are </w:t>
+      </w:r>
+      <w:r>
+        <w:t>primary, so use the primary “</w:t>
+      </w:r>
+      <w:r>
+        <w:t>&lt;</w:t>
+      </w:r>
       <w:r>
         <w:t>”</w:t>
       </w:r>
       <w:r>
-        <w:t xml:space="preserve"> digraph comes after </w:t>
-      </w:r>
-      <w:r>
-        <w:t>“</w:t>
-      </w:r>
-      <w:r>
-        <w:t>c</w:t>
-      </w:r>
-      <w:r>
-        <w:t>”</w:t>
-      </w:r>
-      <w:r>
-        <w:t xml:space="preserve"> with primary </w:t>
-      </w:r>
-      <w:r>
-        <w:t>ordering</w:t>
-      </w:r>
-      <w:r>
-        <w:t>.</w:t>
-      </w:r>
-    </w:p>
-    <w:p>
-      <w:pPr>
-        <w:pStyle w:val="Example"/>
-      </w:pPr>
-      <w:r>
-        <w:t xml:space="preserve">&amp;c &lt; </w:t>
-      </w:r>
-      <w:proofErr w:type="spellStart"/>
-      <w:r>
-        <w:t>ch</w:t>
-      </w:r>
-      <w:proofErr w:type="spellEnd"/>
-      <w:r>
-        <w:t xml:space="preserve"> &lt;&lt;&lt; Ch</w:t>
-      </w:r>
-    </w:p>
-    <w:p>
-      <w:pPr>
-        <w:pStyle w:val="BodyText"/>
-      </w:pPr>
-      <w:r>
-        <w:t xml:space="preserve">One difference in the typical Toolbox sorting and ICU sorting is that Toolbox typically has uppercase letters coming before lowercase letters while ICU defaults to uppercase letters following lowercase letters using tertiary ordering. There is a single rule that tells ICU to put uppercase first regardless of how it is specified in the tertiary rules. By using this rule, you don't have to specify each combination of UC/LC as is needed in Toolbox. In </w:t>
-      </w:r>
-      <w:r>
-        <w:t>FLEx</w:t>
-      </w:r>
-      <w:r>
-        <w:t>,</w:t>
-      </w:r>
-      <w:r>
-        <w:t xml:space="preserve"> the </w:t>
-      </w:r>
-      <w:r>
-        <w:t>letter heading</w:t>
-      </w:r>
-      <w:r>
-        <w:t>s work more reliably if we use default LC first rules and add this command at the beginning to tell ICU to use the opposite case order. So now our final collation for the above simple sample is</w:t>
-      </w:r>
-    </w:p>
-    <w:p>
-      <w:pPr>
-        <w:pStyle w:val="Example"/>
-      </w:pPr>
-      <w:r>
-        <w:t>[</w:t>
+        <w:t xml:space="preserve"> ICU relation. Characters that appear between spaces on a line are secondary, so use the secondary </w:t>
+      </w:r>
+      <w:r>
+        <w:t>“&lt;&lt;”</w:t>
+      </w:r>
+      <w:r>
+        <w:t xml:space="preserve"> ICU relation. If they specify uppercase before lowercase, just add the [</w:t>
       </w:r>
       <w:proofErr w:type="spellStart"/>
       <w:r>
@@ -8008,732 +8659,7 @@
       </w:r>
       <w:proofErr w:type="spellEnd"/>
       <w:r>
-        <w:t xml:space="preserve"> upper]</w:t>
-      </w:r>
-      <w:r>
-        <w:br/>
-      </w:r>
-      <w:r>
-        <w:t xml:space="preserve">&amp;c &lt; </w:t>
-      </w:r>
-      <w:proofErr w:type="spellStart"/>
-      <w:r>
-        <w:t>ch</w:t>
-      </w:r>
-      <w:proofErr w:type="spellEnd"/>
-      <w:r>
-        <w:t xml:space="preserve"> &lt;&lt;&lt; Ch</w:t>
-      </w:r>
-    </w:p>
-    <w:p>
-      <w:pPr>
-        <w:pStyle w:val="BodyText"/>
-      </w:pPr>
-      <w:r>
-        <w:t>If Toolbo</w:t>
-      </w:r>
-      <w:r>
-        <w:t>x has a secondary sort for a di</w:t>
-      </w:r>
-      <w:r>
-        <w:t>graph as with this line</w:t>
-      </w:r>
-    </w:p>
-    <w:p>
-      <w:pPr>
-        <w:pStyle w:val="Example"/>
-      </w:pPr>
-      <w:r>
-        <w:t xml:space="preserve">G </w:t>
-      </w:r>
-      <w:proofErr w:type="spellStart"/>
-      <w:r>
-        <w:t>g</w:t>
-      </w:r>
-      <w:proofErr w:type="spellEnd"/>
-      <w:r>
-        <w:t xml:space="preserve"> </w:t>
-      </w:r>
-      <w:proofErr w:type="spellStart"/>
-      <w:r>
-        <w:t>gu</w:t>
-      </w:r>
-      <w:proofErr w:type="spellEnd"/>
-    </w:p>
-    <w:p>
-      <w:pPr>
-        <w:pStyle w:val="BodyText"/>
-      </w:pPr>
-      <w:r>
-        <w:t xml:space="preserve">then this can be replaced with this ICU rule which specifies </w:t>
-      </w:r>
-      <w:proofErr w:type="spellStart"/>
-      <w:r>
-        <w:t>gu</w:t>
-      </w:r>
-      <w:proofErr w:type="spellEnd"/>
-      <w:r>
-        <w:t xml:space="preserve"> is a secondary ordering after g instead of primary.</w:t>
-      </w:r>
-    </w:p>
-    <w:p>
-      <w:pPr>
-        <w:pStyle w:val="Example"/>
-      </w:pPr>
-      <w:r>
-        <w:t xml:space="preserve">&amp;g &lt;&lt; </w:t>
-      </w:r>
-      <w:proofErr w:type="spellStart"/>
-      <w:r>
-        <w:t>gu</w:t>
-      </w:r>
-      <w:proofErr w:type="spellEnd"/>
-    </w:p>
-    <w:p>
-      <w:pPr>
-        <w:pStyle w:val="BodyText"/>
-      </w:pPr>
-      <w:r>
-        <w:t>If Toolbox has a combination of secondary and primary ordering following a standard alphabetic character like this</w:t>
-      </w:r>
-    </w:p>
-    <w:p>
-      <w:pPr>
-        <w:pStyle w:val="Example"/>
-      </w:pPr>
-      <w:r>
-        <w:t xml:space="preserve">G </w:t>
-      </w:r>
-      <w:proofErr w:type="spellStart"/>
-      <w:r>
-        <w:t>g</w:t>
-      </w:r>
-      <w:proofErr w:type="spellEnd"/>
-      <w:r>
-        <w:t xml:space="preserve"> </w:t>
-      </w:r>
-      <w:proofErr w:type="spellStart"/>
-      <w:r>
-        <w:t>gu</w:t>
-      </w:r>
-      <w:proofErr w:type="spellEnd"/>
-      <w:r>
-        <w:t xml:space="preserve"> </w:t>
-      </w:r>
-      <w:proofErr w:type="spellStart"/>
-      <w:r>
-        <w:t>gü</w:t>
-      </w:r>
-      <w:proofErr w:type="spellEnd"/>
-      <w:r>
-        <w:br/>
-      </w:r>
-      <w:r>
-        <w:t>ꞌG ꞌg</w:t>
-      </w:r>
-    </w:p>
-    <w:p>
-      <w:pPr>
-        <w:pStyle w:val="BodyText"/>
-      </w:pPr>
-      <w:r>
-        <w:t>then you could use this ICU rule</w:t>
-      </w:r>
-    </w:p>
-    <w:p>
-      <w:pPr>
-        <w:pStyle w:val="Example"/>
-      </w:pPr>
-      <w:r>
-        <w:t xml:space="preserve">&amp; g &lt;&lt; </w:t>
-      </w:r>
-      <w:proofErr w:type="spellStart"/>
-      <w:r>
-        <w:t>gu</w:t>
-      </w:r>
-      <w:proofErr w:type="spellEnd"/>
-      <w:r>
-        <w:t xml:space="preserve"> &lt;&lt; </w:t>
-      </w:r>
-      <w:proofErr w:type="spellStart"/>
-      <w:r>
-        <w:t>gü</w:t>
-      </w:r>
-      <w:proofErr w:type="spellEnd"/>
-      <w:r>
-        <w:t xml:space="preserve"> &lt; ꞌg &lt;&lt;&lt; ꞌG</w:t>
-      </w:r>
-    </w:p>
-    <w:p>
-      <w:pPr>
-        <w:pStyle w:val="BodyText"/>
-      </w:pPr>
-      <w:r>
-        <w:lastRenderedPageBreak/>
-        <w:t>This uses “</w:t>
-      </w:r>
-      <w:r>
-        <w:t>&lt;</w:t>
-      </w:r>
-      <w:r>
-        <w:t>”</w:t>
-      </w:r>
-      <w:r>
-        <w:t xml:space="preserve"> for every primary relation </w:t>
-      </w:r>
-      <w:r>
-        <w:t xml:space="preserve">(new line in a Toolbox specification) </w:t>
-      </w:r>
-      <w:r>
-        <w:t xml:space="preserve">and </w:t>
-      </w:r>
-      <w:r>
-        <w:t>“</w:t>
-      </w:r>
-      <w:r>
-        <w:t>&lt;&lt;</w:t>
-      </w:r>
-      <w:r>
-        <w:t>”</w:t>
-      </w:r>
-      <w:r>
-        <w:t xml:space="preserve"> for secondary</w:t>
-      </w:r>
-      <w:r>
-        <w:t xml:space="preserve"> (following space in a Toolbox specification)</w:t>
-      </w:r>
-      <w:r>
-        <w:t xml:space="preserve">, and </w:t>
-      </w:r>
-      <w:r>
-        <w:t>“</w:t>
-      </w:r>
-      <w:r>
-        <w:t>&lt;&lt;&lt;</w:t>
-      </w:r>
-      <w:r>
-        <w:t>”</w:t>
-      </w:r>
-      <w:r>
-        <w:t xml:space="preserve"> for tertiary</w:t>
-      </w:r>
-      <w:r>
-        <w:t xml:space="preserve"> to handle uppercase</w:t>
-      </w:r>
-      <w:r>
-        <w:t>.</w:t>
-      </w:r>
-    </w:p>
-    <w:p>
-      <w:pPr>
-        <w:pStyle w:val="BodyText"/>
-      </w:pPr>
-      <w:r>
-        <w:t>Toolbox specifies diacritic ordering like this.</w:t>
-      </w:r>
-    </w:p>
-    <w:p>
-      <w:pPr>
-        <w:pStyle w:val="Example"/>
-      </w:pPr>
-      <w:r>
-        <w:rPr>
-          <w:rFonts w:hint="eastAsia"/>
-        </w:rPr>
-        <w:t>\</w:t>
-      </w:r>
-      <w:proofErr w:type="spellStart"/>
-      <w:r>
-        <w:rPr>
-          <w:rFonts w:hint="eastAsia"/>
-        </w:rPr>
-        <w:t>SecFollowing</w:t>
-      </w:r>
-      <w:proofErr w:type="spellEnd"/>
-      <w:r>
-        <w:rPr>
-          <w:rFonts w:hint="eastAsia"/>
-        </w:rPr>
-        <w:t xml:space="preserve"> </w:t>
-      </w:r>
-      <w:r>
-        <w:rPr>
-          <w:rFonts w:hint="eastAsia"/>
-        </w:rPr>
-        <w:t>ˋ</w:t>
-      </w:r>
-      <w:r>
-        <w:rPr>
-          <w:rFonts w:hint="eastAsia"/>
-        </w:rPr>
-        <w:t xml:space="preserve"> </w:t>
-      </w:r>
-      <w:r>
-        <w:rPr>
-          <w:rFonts w:hint="eastAsia"/>
-        </w:rPr>
-        <w:t>¯</w:t>
-      </w:r>
-      <w:r>
-        <w:rPr>
-          <w:rFonts w:hint="eastAsia"/>
-        </w:rPr>
-        <w:t xml:space="preserve"> </w:t>
-      </w:r>
-      <w:r>
-        <w:rPr>
-          <w:rFonts w:hint="eastAsia"/>
-        </w:rPr>
-        <w:t>ˆ</w:t>
-      </w:r>
-      <w:r>
-        <w:rPr>
-          <w:rFonts w:hint="eastAsia"/>
-        </w:rPr>
-        <w:t xml:space="preserve"> </w:t>
-      </w:r>
-      <w:r>
-        <w:rPr>
-          <w:rFonts w:hint="eastAsia"/>
-        </w:rPr>
-        <w:t>ˊ</w:t>
-      </w:r>
-      <w:r>
-        <w:rPr>
-          <w:rFonts w:hint="eastAsia"/>
-        </w:rPr>
-        <w:t xml:space="preserve"> </w:t>
-      </w:r>
-      <w:r>
-        <w:rPr>
-          <w:rFonts w:hint="eastAsia"/>
-        </w:rPr>
-        <w:t>˜</w:t>
-      </w:r>
-      <w:r>
-        <w:rPr>
-          <w:rFonts w:hint="eastAsia"/>
-        </w:rPr>
-        <w:t xml:space="preserve"> </w:t>
-      </w:r>
-      <w:r>
-        <w:rPr>
-          <w:rFonts w:hint="eastAsia"/>
-        </w:rPr>
-        <w:t>ˇ</w:t>
-      </w:r>
-    </w:p>
-    <w:p>
-      <w:pPr>
-        <w:pStyle w:val="BodyText"/>
-      </w:pPr>
-      <w:r>
-        <w:t>ICU defaults to secondary ordering of all diacritics using a fixed order. However, these characters are not true diacritics, but modifier letter diacritics that do not combine with a vowel. Toolbox specifies these as secondary ordering, so we can replace this with the equivalent ICU rule for secondary ordering.</w:t>
-      </w:r>
-    </w:p>
-    <w:p>
-      <w:pPr>
-        <w:pStyle w:val="Example"/>
-      </w:pPr>
-      <w:r>
-        <w:rPr>
-          <w:rFonts w:hint="eastAsia"/>
-        </w:rPr>
-        <w:t xml:space="preserve">&amp; [first secondary ignorable] &lt;&lt; </w:t>
-      </w:r>
-      <w:r>
-        <w:rPr>
-          <w:rFonts w:hint="eastAsia"/>
-        </w:rPr>
-        <w:t>ˋ</w:t>
-      </w:r>
-      <w:r>
-        <w:rPr>
-          <w:rFonts w:hint="eastAsia"/>
-        </w:rPr>
-        <w:t xml:space="preserve"> &lt;&lt; </w:t>
-      </w:r>
-      <w:r>
-        <w:rPr>
-          <w:rFonts w:hint="eastAsia"/>
-        </w:rPr>
-        <w:t>¯</w:t>
-      </w:r>
-      <w:r>
-        <w:rPr>
-          <w:rFonts w:hint="eastAsia"/>
-        </w:rPr>
-        <w:t xml:space="preserve"> &lt;&lt; </w:t>
-      </w:r>
-      <w:r>
-        <w:rPr>
-          <w:rFonts w:hint="eastAsia"/>
-        </w:rPr>
-        <w:t>ˆ</w:t>
-      </w:r>
-      <w:r>
-        <w:rPr>
-          <w:rFonts w:hint="eastAsia"/>
-        </w:rPr>
-        <w:t xml:space="preserve"> &lt;&lt; </w:t>
-      </w:r>
-      <w:r>
-        <w:rPr>
-          <w:rFonts w:hint="eastAsia"/>
-        </w:rPr>
-        <w:t>ˊ</w:t>
-      </w:r>
-      <w:r>
-        <w:rPr>
-          <w:rFonts w:hint="eastAsia"/>
-        </w:rPr>
-        <w:t xml:space="preserve"> &lt;&lt; </w:t>
-      </w:r>
-      <w:r>
-        <w:rPr>
-          <w:rFonts w:hint="eastAsia"/>
-        </w:rPr>
-        <w:t>˜</w:t>
-      </w:r>
-      <w:r>
-        <w:rPr>
-          <w:rFonts w:hint="eastAsia"/>
-        </w:rPr>
-        <w:t xml:space="preserve"> &lt;&lt; </w:t>
-      </w:r>
-      <w:r>
-        <w:rPr>
-          <w:rFonts w:hint="eastAsia"/>
-        </w:rPr>
-        <w:t>ˇ</w:t>
-      </w:r>
-    </w:p>
-    <w:p>
-      <w:pPr>
-        <w:pStyle w:val="BodyText"/>
-      </w:pPr>
-      <w:r>
-        <w:t>Toolbox specifies characters to be ignored in this way.</w:t>
-      </w:r>
-    </w:p>
-    <w:p>
-      <w:pPr>
-        <w:pStyle w:val="Example"/>
-      </w:pPr>
-      <w:r>
-        <w:t>\ignore _ - =</w:t>
-      </w:r>
-    </w:p>
-    <w:p>
-      <w:pPr>
-        <w:pStyle w:val="BodyText"/>
-      </w:pPr>
-      <w:r>
-        <w:t>This can be turned into an ICU rule that ignores these characters.</w:t>
-      </w:r>
-    </w:p>
-    <w:p>
-      <w:pPr>
-        <w:pStyle w:val="Example"/>
-      </w:pPr>
-      <w:r>
-        <w:t>&amp; [last tertiary ignorable] = '_' = '-' = '='</w:t>
-      </w:r>
-    </w:p>
-    <w:p>
-      <w:pPr>
-        <w:pStyle w:val="BodyText"/>
-      </w:pPr>
-      <w:r>
-        <w:t>ICU defaults to sorting digits before alphabetical characters. If you want to place digits at the end of the alphabet</w:t>
-      </w:r>
-      <w:r>
-        <w:t xml:space="preserve"> as in this case</w:t>
-      </w:r>
-      <w:r>
-        <w:t>, you can use this ICU rule:</w:t>
-      </w:r>
-    </w:p>
-    <w:p>
-      <w:pPr>
-        <w:pStyle w:val="Example"/>
-      </w:pPr>
-      <w:proofErr w:type="gramStart"/>
-      <w:r>
-        <w:t>&amp;[</w:t>
-      </w:r>
-      <w:proofErr w:type="gramEnd"/>
-      <w:r>
-        <w:t>last regular]</w:t>
-      </w:r>
-      <w:r>
-        <w:t>&lt; 0 &lt; 1 &lt; 2 &lt; 3 &lt; 4 &lt; 5 &lt; 6 &lt; 7 &lt; 8 &lt; 9</w:t>
-      </w:r>
-    </w:p>
-    <w:p>
-      <w:pPr>
-        <w:pStyle w:val="BodyText"/>
-      </w:pPr>
-      <w:r>
-        <w:t xml:space="preserve">Putting all of this together, here is the complete </w:t>
-      </w:r>
-      <w:r>
-        <w:t xml:space="preserve">ICU </w:t>
-      </w:r>
-      <w:r>
-        <w:t>collation.</w:t>
-      </w:r>
-    </w:p>
-    <w:p>
-      <w:pPr>
-        <w:pStyle w:val="Example"/>
-      </w:pPr>
-      <w:r>
-        <w:t>[</w:t>
-      </w:r>
-      <w:proofErr w:type="spellStart"/>
-      <w:r>
-        <w:t>caseFirst</w:t>
-      </w:r>
-      <w:proofErr w:type="spellEnd"/>
-      <w:r>
-        <w:t xml:space="preserve"> upper]</w:t>
-      </w:r>
-      <w:r>
-        <w:br/>
-      </w:r>
-      <w:r>
-        <w:t>&amp; a &lt;&lt; á &lt;&lt;&lt; Á &lt;&lt; a̱ &lt;&lt;&lt; A̱ &lt;&lt; á̱ &lt;&lt;&lt; Á̱</w:t>
-      </w:r>
-      <w:r>
-        <w:br/>
-      </w:r>
-      <w:r>
-        <w:t xml:space="preserve">&amp; c &lt; </w:t>
-      </w:r>
-      <w:proofErr w:type="spellStart"/>
-      <w:r>
-        <w:t>ch</w:t>
-      </w:r>
-      <w:proofErr w:type="spellEnd"/>
-      <w:r>
-        <w:t xml:space="preserve"> &lt;&lt;&lt; Ch</w:t>
-      </w:r>
-      <w:r>
-        <w:br/>
-      </w:r>
-      <w:r>
-        <w:t>&amp; e &lt;&lt; é &lt;&lt;&lt; É &lt;&lt; e̱ &lt;&lt;&lt; E̱ &lt;&lt; é̱ &lt;&lt;&lt; É̱</w:t>
-      </w:r>
-      <w:r>
-        <w:br/>
-      </w:r>
-      <w:r>
-        <w:t xml:space="preserve">&amp; g &lt;&lt; </w:t>
-      </w:r>
-      <w:proofErr w:type="spellStart"/>
-      <w:r>
-        <w:t>gu</w:t>
-      </w:r>
-      <w:proofErr w:type="spellEnd"/>
-      <w:r>
-        <w:t xml:space="preserve"> &lt;&lt; </w:t>
-      </w:r>
-      <w:proofErr w:type="spellStart"/>
-      <w:r>
-        <w:t>gü</w:t>
-      </w:r>
-      <w:proofErr w:type="spellEnd"/>
-      <w:r>
-        <w:t xml:space="preserve"> &lt; ꞌg &lt;&lt;&lt; ꞌG</w:t>
-      </w:r>
-      <w:r>
-        <w:br/>
-      </w:r>
-      <w:r>
-        <w:t xml:space="preserve">&amp; </w:t>
-      </w:r>
-      <w:proofErr w:type="spellStart"/>
-      <w:r>
-        <w:t>i</w:t>
-      </w:r>
-      <w:proofErr w:type="spellEnd"/>
-      <w:r>
-        <w:t xml:space="preserve"> &lt;&lt; í &lt;&lt;&lt; Í &lt;&lt; </w:t>
-      </w:r>
-      <w:proofErr w:type="spellStart"/>
-      <w:r>
-        <w:t>i</w:t>
-      </w:r>
-      <w:proofErr w:type="spellEnd"/>
-      <w:r>
-        <w:t>̱ &lt;&lt;&lt; I̱ &lt;&lt; í̱ &lt;&lt;&lt; Í̱ &lt; ɨ &lt;&lt;&lt; Ɨ &lt;&lt; ɨ́ &lt;&lt;&lt; Ɨ́ &lt;&lt; ɨ̱́ &lt;&lt;&lt; ̱́</w:t>
-      </w:r>
-      <w:r>
-        <w:br/>
-      </w:r>
-      <w:r>
-        <w:t>&amp; l &lt; ꞌl &lt;&lt;&lt; ꞌL</w:t>
-      </w:r>
-      <w:r>
-        <w:br/>
-      </w:r>
-      <w:r>
-        <w:t>&amp; m &lt; ꞌm &lt;&lt;&lt; ꞌM</w:t>
-      </w:r>
-      <w:r>
-        <w:br/>
-      </w:r>
-      <w:r>
-        <w:t>&amp; n &lt; ꞌñ &lt;&lt;&lt; ꞌÑ</w:t>
-      </w:r>
-      <w:r>
-        <w:br/>
-      </w:r>
-      <w:r>
-        <w:t>&amp; o &lt;&lt; ó &lt;&lt;&lt; Ó &lt;&lt; o̱ &lt;&lt;&lt; O̱ &lt;&lt; ó̱ &lt;&lt;&lt; Ó̱ &lt; ø &lt;&lt;&lt; Ø &lt;&lt; ǿ &lt;&lt;&lt; Ǿ &lt;&lt; ø̱ &lt;&lt;&lt; Ø̱ &lt;&lt; ǿ̱ &lt;&lt;&lt; Ǿ̱</w:t>
-      </w:r>
-      <w:r>
-        <w:br/>
-      </w:r>
-      <w:r>
-        <w:t>&amp; u &lt;&lt; ú &lt;&lt;&lt; Ú &lt;&lt; u̱ &lt;&lt;&lt; U̱ &lt;&lt; ú̱ &lt;&lt;&lt; Ú̱ &lt;&lt; ü &lt; ʉ &lt;&lt;&lt; Ʉ &lt;&lt; ʉ́ &lt;&lt;&lt; Ʉ́ &lt;&lt; ʉ̱ &lt;&lt;&lt; Ʉ̱ &lt;&lt; ʉ̱́ &lt;&lt;&lt; ̱́</w:t>
-      </w:r>
-      <w:r>
-        <w:br/>
-      </w:r>
-      <w:r>
-        <w:t>&amp;[last regular]</w:t>
-      </w:r>
-      <w:r>
-        <w:t xml:space="preserve"> &lt; ꞌ &lt; 0 &lt; 1 &lt; 2 &lt; 3 &lt; 4 &lt; 5 &lt; 6 &lt; 7 &lt; 8 &lt; 9</w:t>
-      </w:r>
-      <w:r>
-        <w:br/>
-      </w:r>
-      <w:r>
-        <w:rPr>
-          <w:rFonts w:hint="eastAsia"/>
-        </w:rPr>
-        <w:t xml:space="preserve">&amp; [first secondary ignorable] &lt;&lt; </w:t>
-      </w:r>
-      <w:r>
-        <w:rPr>
-          <w:rFonts w:hint="eastAsia"/>
-        </w:rPr>
-        <w:t>ˋ</w:t>
-      </w:r>
-      <w:r>
-        <w:rPr>
-          <w:rFonts w:hint="eastAsia"/>
-        </w:rPr>
-        <w:t xml:space="preserve"> &lt;&lt; </w:t>
-      </w:r>
-      <w:r>
-        <w:rPr>
-          <w:rFonts w:hint="eastAsia"/>
-        </w:rPr>
-        <w:t>¯</w:t>
-      </w:r>
-      <w:r>
-        <w:rPr>
-          <w:rFonts w:hint="eastAsia"/>
-        </w:rPr>
-        <w:t xml:space="preserve"> &lt;&lt; </w:t>
-      </w:r>
-      <w:r>
-        <w:rPr>
-          <w:rFonts w:hint="eastAsia"/>
-        </w:rPr>
-        <w:t>ˆ</w:t>
-      </w:r>
-      <w:r>
-        <w:rPr>
-          <w:rFonts w:hint="eastAsia"/>
-        </w:rPr>
-        <w:t xml:space="preserve"> &lt;&lt; </w:t>
-      </w:r>
-      <w:r>
-        <w:rPr>
-          <w:rFonts w:hint="eastAsia"/>
-        </w:rPr>
-        <w:t>ˊ</w:t>
-      </w:r>
-      <w:r>
-        <w:rPr>
-          <w:rFonts w:hint="eastAsia"/>
-        </w:rPr>
-        <w:t xml:space="preserve"> &lt;&lt; </w:t>
-      </w:r>
-      <w:r>
-        <w:rPr>
-          <w:rFonts w:hint="eastAsia"/>
-        </w:rPr>
-        <w:t>˜</w:t>
-      </w:r>
-      <w:r>
-        <w:rPr>
-          <w:rFonts w:hint="eastAsia"/>
-        </w:rPr>
-        <w:t xml:space="preserve"> &lt;&lt; </w:t>
-      </w:r>
-      <w:r>
-        <w:rPr>
-          <w:rFonts w:hint="eastAsia"/>
-        </w:rPr>
-        <w:t>ˇ</w:t>
-      </w:r>
-      <w:r>
-        <w:br/>
-      </w:r>
-      <w:r>
-        <w:t>&amp; [last tertiary ignorable] = '_' = '-' = '='</w:t>
-      </w:r>
-    </w:p>
-    <w:p>
-      <w:pPr>
-        <w:pStyle w:val="BodyText"/>
-      </w:pPr>
-      <w:r>
-        <w:t xml:space="preserve">In general, you can take a Toolbox </w:t>
-      </w:r>
-      <w:proofErr w:type="spellStart"/>
-      <w:r>
-        <w:t>lng</w:t>
-      </w:r>
-      <w:proofErr w:type="spellEnd"/>
-      <w:r>
-        <w:t xml:space="preserve"> file and convert it to ICU rules quite easily. Anything that sorts by default in ICU can be dropped. Characters that start a new line are </w:t>
-      </w:r>
-      <w:r>
-        <w:t>primary, so use the primary “</w:t>
-      </w:r>
-      <w:r>
-        <w:t>&lt;</w:t>
-      </w:r>
-      <w:r>
-        <w:t>”</w:t>
-      </w:r>
-      <w:r>
-        <w:t xml:space="preserve"> ICU relation. Characters that appear between spaces on a line are secondary, so use the secondary </w:t>
-      </w:r>
-      <w:r>
-        <w:t>“&lt;&lt;”</w:t>
-      </w:r>
-      <w:r>
-        <w:t xml:space="preserve"> ICU relation. If they specify uppercase before lowercase, just add the [</w:t>
-      </w:r>
-      <w:proofErr w:type="spellStart"/>
-      <w:r>
-        <w:t>caseFirst</w:t>
-      </w:r>
-      <w:proofErr w:type="spellEnd"/>
-      <w:r>
-        <w:t xml:space="preserve"> upper] rule at the top and do everything else as </w:t>
-      </w:r>
-      <w:r>
-        <w:lastRenderedPageBreak/>
-        <w:t xml:space="preserve">though it were the standard ICU putting uppercase </w:t>
+        <w:t xml:space="preserve"> upper] rule at the top and do everything else as though it were the standard ICU putting uppercase </w:t>
       </w:r>
       <w:r>
         <w:t>after lowercase using tertiary “</w:t>
@@ -8803,7 +8729,7 @@
       <w:rPr>
         <w:noProof/>
       </w:rPr>
-      <w:t>6/26/2025</w:t>
+      <w:t>7/23/2026</w:t>
     </w:r>
     <w:r>
       <w:fldChar w:fldCharType="end"/>
@@ -8831,7 +8757,7 @@
       <w:rPr>
         <w:noProof/>
       </w:rPr>
-      <w:t>6/26/2025</w:t>
+      <w:t>7/23/2026</w:t>
     </w:r>
     <w:r>
       <w:fldChar w:fldCharType="end"/>
@@ -8962,7 +8888,7 @@
       </w:tabs>
     </w:pPr>
     <w:r>
-      <w:t>FieldWorks 7 writing systems</w:t>
+      <w:t>FieldWorks Sorting with ICU Rules</w:t>
     </w:r>
     <w:r>
       <w:tab/>
@@ -11020,7 +10946,7 @@
 </file>
 
 <file path=customXml/itemProps1.xml><?xml version="1.0" encoding="utf-8"?>
-<ds:datastoreItem xmlns:ds="http://schemas.openxmlformats.org/officeDocument/2006/customXml" ds:itemID="{3545B2E1-D795-4F04-A98A-FFC638ACF9DE}">
+<ds:datastoreItem xmlns:ds="http://schemas.openxmlformats.org/officeDocument/2006/customXml" ds:itemID="{84F819ED-C2CA-4141-9638-4DE77B1C677A}">
   <ds:schemaRefs>
     <ds:schemaRef ds:uri="http://schemas.openxmlformats.org/officeDocument/2006/bibliography"/>
   </ds:schemaRefs>

</xml_diff>